<commit_message>
report: konsistensi 4 sumber + docx styling (14 eksperimen)
report_data.json +OCR-006 (DocTR probe) +HYB-001 (hybrid) -> docx/md/xlsx kini 14 eksperimen. baseline_rapid_tess eval.json <- re-eval GT v9+matcher v2 (44.3->45.8%). generate_runs_summary.py baca eval_hybrid_*.json -> row hybrid_49 46.8%. generate_report.py: styling docx (header indigo 1F3864, border lembut, baris selang, highlight winner, heading accent).
</commit_message>
<xml_diff>
--- a/docs/report/evaluation_methodology.docx
+++ b/docs/report/evaluation_methodology.docx
@@ -8,7 +8,7 @@
       </w:pPr>
       <w:r>
         <w:rPr>
-          <w:color w:val="000000"/>
+          <w:color w:val="1F3864"/>
         </w:rPr>
         <w:t>Evaluation Methodology Report</w:t>
       </w:r>
@@ -19,7 +19,7 @@
       </w:pPr>
       <w:r>
         <w:rPr>
-          <w:color w:val="555555"/>
+          <w:color w:val="595959"/>
           <w:sz w:val="24"/>
         </w:rPr>
         <w:t>Certificate Autofill Prototype - Benchmark Metrics, Formulas, and Analysis</w:t>
@@ -51,6 +51,10 @@
         <w:pStyle w:val="Heading1"/>
       </w:pPr>
       <w:r>
+        <w:rPr>
+          <w:rFonts w:ascii="Calibri" w:hAnsi="Calibri"/>
+          <w:color w:val="1F3864"/>
+        </w:rPr>
         <w:t>1. Introduction</w:t>
       </w:r>
     </w:p>
@@ -74,6 +78,10 @@
         <w:pStyle w:val="Heading1"/>
       </w:pPr>
       <w:r>
+        <w:rPr>
+          <w:rFonts w:ascii="Calibri" w:hAnsi="Calibri"/>
+          <w:color w:val="1F3864"/>
+        </w:rPr>
         <w:t>2. Evaluated Fields</w:t>
       </w:r>
     </w:p>
@@ -87,6 +95,14 @@
         <w:tblStyle w:val="TableGrid"/>
         <w:tblW w:type="auto" w:w="0"/>
         <w:tblLook w:firstColumn="1" w:firstRow="1" w:lastColumn="0" w:lastRow="0" w:noHBand="0" w:noVBand="1" w:val="04A0"/>
+        <w:tblBorders>
+          <w:top w:val="single" w:sz="4" w:space="0" w:color="C9D4E4"/>
+          <w:left w:val="single" w:sz="4" w:space="0" w:color="C9D4E4"/>
+          <w:bottom w:val="single" w:sz="4" w:space="0" w:color="C9D4E4"/>
+          <w:right w:val="single" w:sz="4" w:space="0" w:color="C9D4E4"/>
+          <w:insideH w:val="single" w:sz="4" w:space="0" w:color="C9D4E4"/>
+          <w:insideV w:val="single" w:sz="4" w:space="0" w:color="C9D4E4"/>
+        </w:tblBorders>
       </w:tblPr>
       <w:tblGrid>
         <w:gridCol w:w="2880"/>
@@ -97,12 +113,14 @@
         <w:tc>
           <w:tcPr>
             <w:tcW w:type="dxa" w:w="2880"/>
+            <w:shd w:val="clear" w:color="auto" w:fill="1F3864"/>
           </w:tcPr>
           <w:p>
             <w:r/>
             <w:r>
               <w:rPr>
                 <w:b/>
+                <w:color w:val="FFFFFF"/>
                 <w:sz w:val="18"/>
               </w:rPr>
               <w:t>Field</w:t>
@@ -112,12 +130,14 @@
         <w:tc>
           <w:tcPr>
             <w:tcW w:type="dxa" w:w="2880"/>
+            <w:shd w:val="clear" w:color="auto" w:fill="1F3864"/>
           </w:tcPr>
           <w:p>
             <w:r/>
             <w:r>
               <w:rPr>
                 <w:b/>
+                <w:color w:val="FFFFFF"/>
                 <w:sz w:val="18"/>
               </w:rPr>
               <w:t>Type</w:t>
@@ -127,12 +147,14 @@
         <w:tc>
           <w:tcPr>
             <w:tcW w:type="dxa" w:w="2880"/>
+            <w:shd w:val="clear" w:color="auto" w:fill="1F3864"/>
           </w:tcPr>
           <w:p>
             <w:r/>
             <w:r>
               <w:rPr>
                 <w:b/>
+                <w:color w:val="FFFFFF"/>
                 <w:sz w:val="18"/>
               </w:rPr>
               <w:t>Description</w:t>
@@ -188,6 +210,7 @@
         <w:tc>
           <w:tcPr>
             <w:tcW w:type="dxa" w:w="2880"/>
+            <w:shd w:val="clear" w:color="auto" w:fill="F2F6FC"/>
           </w:tcPr>
           <w:p>
             <w:r/>
@@ -202,6 +225,7 @@
         <w:tc>
           <w:tcPr>
             <w:tcW w:type="dxa" w:w="2880"/>
+            <w:shd w:val="clear" w:color="auto" w:fill="F2F6FC"/>
           </w:tcPr>
           <w:p>
             <w:r/>
@@ -216,6 +240,7 @@
         <w:tc>
           <w:tcPr>
             <w:tcW w:type="dxa" w:w="2880"/>
+            <w:shd w:val="clear" w:color="auto" w:fill="F2F6FC"/>
           </w:tcPr>
           <w:p>
             <w:r/>
@@ -276,6 +301,7 @@
         <w:tc>
           <w:tcPr>
             <w:tcW w:type="dxa" w:w="2880"/>
+            <w:shd w:val="clear" w:color="auto" w:fill="F2F6FC"/>
           </w:tcPr>
           <w:p>
             <w:r/>
@@ -290,6 +316,7 @@
         <w:tc>
           <w:tcPr>
             <w:tcW w:type="dxa" w:w="2880"/>
+            <w:shd w:val="clear" w:color="auto" w:fill="F2F6FC"/>
           </w:tcPr>
           <w:p>
             <w:r/>
@@ -304,6 +331,7 @@
         <w:tc>
           <w:tcPr>
             <w:tcW w:type="dxa" w:w="2880"/>
+            <w:shd w:val="clear" w:color="auto" w:fill="F2F6FC"/>
           </w:tcPr>
           <w:p>
             <w:r/>
@@ -364,6 +392,7 @@
         <w:tc>
           <w:tcPr>
             <w:tcW w:type="dxa" w:w="2880"/>
+            <w:shd w:val="clear" w:color="auto" w:fill="F2F6FC"/>
           </w:tcPr>
           <w:p>
             <w:r/>
@@ -378,6 +407,7 @@
         <w:tc>
           <w:tcPr>
             <w:tcW w:type="dxa" w:w="2880"/>
+            <w:shd w:val="clear" w:color="auto" w:fill="F2F6FC"/>
           </w:tcPr>
           <w:p>
             <w:r/>
@@ -392,6 +422,7 @@
         <w:tc>
           <w:tcPr>
             <w:tcW w:type="dxa" w:w="2880"/>
+            <w:shd w:val="clear" w:color="auto" w:fill="F2F6FC"/>
           </w:tcPr>
           <w:p>
             <w:r/>
@@ -411,6 +442,10 @@
         <w:pStyle w:val="Heading1"/>
       </w:pPr>
       <w:r>
+        <w:rPr>
+          <w:rFonts w:ascii="Calibri" w:hAnsi="Calibri"/>
+          <w:color w:val="1F3864"/>
+        </w:rPr>
         <w:t>3. Metrics Definitions</w:t>
       </w:r>
     </w:p>
@@ -424,6 +459,10 @@
         <w:pStyle w:val="Heading2"/>
       </w:pPr>
       <w:r>
+        <w:rPr>
+          <w:rFonts w:ascii="Calibri" w:hAnsi="Calibri"/>
+          <w:color w:val="2F5496"/>
+        </w:rPr>
         <w:t>3.1 Exact Match</w:t>
       </w:r>
     </w:p>
@@ -487,6 +526,10 @@
         <w:pStyle w:val="Heading2"/>
       </w:pPr>
       <w:r>
+        <w:rPr>
+          <w:rFonts w:ascii="Calibri" w:hAnsi="Calibri"/>
+          <w:color w:val="2F5496"/>
+        </w:rPr>
         <w:t>3.2 Fuzzy Match</w:t>
       </w:r>
     </w:p>
@@ -550,6 +593,10 @@
         <w:pStyle w:val="Heading2"/>
       </w:pPr>
       <w:r>
+        <w:rPr>
+          <w:rFonts w:ascii="Calibri" w:hAnsi="Calibri"/>
+          <w:color w:val="2F5496"/>
+        </w:rPr>
         <w:t>3.3 Token Overlap Score</w:t>
       </w:r>
     </w:p>
@@ -613,6 +660,10 @@
         <w:pStyle w:val="Heading2"/>
       </w:pPr>
       <w:r>
+        <w:rPr>
+          <w:rFonts w:ascii="Calibri" w:hAnsi="Calibri"/>
+          <w:color w:val="2F5496"/>
+        </w:rPr>
         <w:t>3.4 Word Error Rate (WER)</w:t>
       </w:r>
     </w:p>
@@ -676,6 +727,10 @@
         <w:pStyle w:val="Heading2"/>
       </w:pPr>
       <w:r>
+        <w:rPr>
+          <w:rFonts w:ascii="Calibri" w:hAnsi="Calibri"/>
+          <w:color w:val="2F5496"/>
+        </w:rPr>
         <w:t>3.5 Character Error Rate (CER)</w:t>
       </w:r>
     </w:p>
@@ -739,6 +794,10 @@
         <w:pStyle w:val="Heading2"/>
       </w:pPr>
       <w:r>
+        <w:rPr>
+          <w:rFonts w:ascii="Calibri" w:hAnsi="Calibri"/>
+          <w:color w:val="2F5496"/>
+        </w:rPr>
         <w:t>3.6 Contains Match</w:t>
       </w:r>
     </w:p>
@@ -802,6 +861,10 @@
         <w:pStyle w:val="Heading2"/>
       </w:pPr>
       <w:r>
+        <w:rPr>
+          <w:rFonts w:ascii="Calibri" w:hAnsi="Calibri"/>
+          <w:color w:val="2F5496"/>
+        </w:rPr>
         <w:t>3.7 Confidence Score</w:t>
       </w:r>
     </w:p>
@@ -865,6 +928,10 @@
         <w:pStyle w:val="Heading1"/>
       </w:pPr>
       <w:r>
+        <w:rPr>
+          <w:rFonts w:ascii="Calibri" w:hAnsi="Calibri"/>
+          <w:color w:val="1F3864"/>
+        </w:rPr>
         <w:t>4. Aggregation</w:t>
       </w:r>
     </w:p>
@@ -873,6 +940,10 @@
         <w:pStyle w:val="Heading2"/>
       </w:pPr>
       <w:r>
+        <w:rPr>
+          <w:rFonts w:ascii="Calibri" w:hAnsi="Calibri"/>
+          <w:color w:val="2F5496"/>
+        </w:rPr>
         <w:t>4.1 Per-Field Metrics</w:t>
       </w:r>
     </w:p>
@@ -906,6 +977,10 @@
         <w:pStyle w:val="Heading2"/>
       </w:pPr>
       <w:r>
+        <w:rPr>
+          <w:rFonts w:ascii="Calibri" w:hAnsi="Calibri"/>
+          <w:color w:val="2F5496"/>
+        </w:rPr>
         <w:t>4.2 Overall Metrics (macro_avg)</w:t>
       </w:r>
     </w:p>
@@ -934,6 +1009,10 @@
         <w:pStyle w:val="Heading1"/>
       </w:pPr>
       <w:r>
+        <w:rPr>
+          <w:rFonts w:ascii="Calibri" w:hAnsi="Calibri"/>
+          <w:color w:val="1F3864"/>
+        </w:rPr>
         <w:t>5. Evaluation Pipeline</w:t>
       </w:r>
     </w:p>
@@ -987,6 +1066,10 @@
         <w:pStyle w:val="Heading1"/>
       </w:pPr>
       <w:r>
+        <w:rPr>
+          <w:rFonts w:ascii="Calibri" w:hAnsi="Calibri"/>
+          <w:color w:val="1F3864"/>
+        </w:rPr>
         <w:t>6. Benchmark Methods</w:t>
       </w:r>
     </w:p>
@@ -1000,6 +1083,14 @@
         <w:tblStyle w:val="TableGrid"/>
         <w:tblW w:type="auto" w:w="0"/>
         <w:tblLook w:firstColumn="1" w:firstRow="1" w:lastColumn="0" w:lastRow="0" w:noHBand="0" w:noVBand="1" w:val="04A0"/>
+        <w:tblBorders>
+          <w:top w:val="single" w:sz="4" w:space="0" w:color="C9D4E4"/>
+          <w:left w:val="single" w:sz="4" w:space="0" w:color="C9D4E4"/>
+          <w:bottom w:val="single" w:sz="4" w:space="0" w:color="C9D4E4"/>
+          <w:right w:val="single" w:sz="4" w:space="0" w:color="C9D4E4"/>
+          <w:insideH w:val="single" w:sz="4" w:space="0" w:color="C9D4E4"/>
+          <w:insideV w:val="single" w:sz="4" w:space="0" w:color="C9D4E4"/>
+        </w:tblBorders>
       </w:tblPr>
       <w:tblGrid>
         <w:gridCol w:w="2880"/>
@@ -1010,12 +1101,14 @@
         <w:tc>
           <w:tcPr>
             <w:tcW w:type="dxa" w:w="2880"/>
+            <w:shd w:val="clear" w:color="auto" w:fill="1F3864"/>
           </w:tcPr>
           <w:p>
             <w:r/>
             <w:r>
               <w:rPr>
                 <w:b/>
+                <w:color w:val="FFFFFF"/>
                 <w:sz w:val="18"/>
               </w:rPr>
               <w:t>Method</w:t>
@@ -1025,12 +1118,14 @@
         <w:tc>
           <w:tcPr>
             <w:tcW w:type="dxa" w:w="2880"/>
+            <w:shd w:val="clear" w:color="auto" w:fill="1F3864"/>
           </w:tcPr>
           <w:p>
             <w:r/>
             <w:r>
               <w:rPr>
                 <w:b/>
+                <w:color w:val="FFFFFF"/>
                 <w:sz w:val="18"/>
               </w:rPr>
               <w:t>Approach</w:t>
@@ -1040,12 +1135,14 @@
         <w:tc>
           <w:tcPr>
             <w:tcW w:type="dxa" w:w="2880"/>
+            <w:shd w:val="clear" w:color="auto" w:fill="1F3864"/>
           </w:tcPr>
           <w:p>
             <w:r/>
             <w:r>
               <w:rPr>
                 <w:b/>
+                <w:color w:val="FFFFFF"/>
                 <w:sz w:val="18"/>
               </w:rPr>
               <w:t>Key Characteristics</w:t>
@@ -1101,6 +1198,7 @@
         <w:tc>
           <w:tcPr>
             <w:tcW w:type="dxa" w:w="2880"/>
+            <w:shd w:val="clear" w:color="auto" w:fill="F2F6FC"/>
           </w:tcPr>
           <w:p>
             <w:r/>
@@ -1115,6 +1213,7 @@
         <w:tc>
           <w:tcPr>
             <w:tcW w:type="dxa" w:w="2880"/>
+            <w:shd w:val="clear" w:color="auto" w:fill="F2F6FC"/>
           </w:tcPr>
           <w:p>
             <w:r/>
@@ -1129,6 +1228,7 @@
         <w:tc>
           <w:tcPr>
             <w:tcW w:type="dxa" w:w="2880"/>
+            <w:shd w:val="clear" w:color="auto" w:fill="F2F6FC"/>
           </w:tcPr>
           <w:p>
             <w:r/>
@@ -1189,6 +1289,7 @@
         <w:tc>
           <w:tcPr>
             <w:tcW w:type="dxa" w:w="2880"/>
+            <w:shd w:val="clear" w:color="auto" w:fill="F2F6FC"/>
           </w:tcPr>
           <w:p>
             <w:r/>
@@ -1203,6 +1304,7 @@
         <w:tc>
           <w:tcPr>
             <w:tcW w:type="dxa" w:w="2880"/>
+            <w:shd w:val="clear" w:color="auto" w:fill="F2F6FC"/>
           </w:tcPr>
           <w:p>
             <w:r/>
@@ -1217,6 +1319,7 @@
         <w:tc>
           <w:tcPr>
             <w:tcW w:type="dxa" w:w="2880"/>
+            <w:shd w:val="clear" w:color="auto" w:fill="F2F6FC"/>
           </w:tcPr>
           <w:p>
             <w:r/>
@@ -1277,6 +1380,7 @@
         <w:tc>
           <w:tcPr>
             <w:tcW w:type="dxa" w:w="2880"/>
+            <w:shd w:val="clear" w:color="auto" w:fill="F2F6FC"/>
           </w:tcPr>
           <w:p>
             <w:r/>
@@ -1291,6 +1395,7 @@
         <w:tc>
           <w:tcPr>
             <w:tcW w:type="dxa" w:w="2880"/>
+            <w:shd w:val="clear" w:color="auto" w:fill="F2F6FC"/>
           </w:tcPr>
           <w:p>
             <w:r/>
@@ -1305,6 +1410,7 @@
         <w:tc>
           <w:tcPr>
             <w:tcW w:type="dxa" w:w="2880"/>
+            <w:shd w:val="clear" w:color="auto" w:fill="F2F6FC"/>
           </w:tcPr>
           <w:p>
             <w:r/>
@@ -1365,6 +1471,7 @@
         <w:tc>
           <w:tcPr>
             <w:tcW w:type="dxa" w:w="2880"/>
+            <w:shd w:val="clear" w:color="auto" w:fill="F2F6FC"/>
           </w:tcPr>
           <w:p>
             <w:r/>
@@ -1379,6 +1486,7 @@
         <w:tc>
           <w:tcPr>
             <w:tcW w:type="dxa" w:w="2880"/>
+            <w:shd w:val="clear" w:color="auto" w:fill="F2F6FC"/>
           </w:tcPr>
           <w:p>
             <w:r/>
@@ -1393,6 +1501,7 @@
         <w:tc>
           <w:tcPr>
             <w:tcW w:type="dxa" w:w="2880"/>
+            <w:shd w:val="clear" w:color="auto" w:fill="F2F6FC"/>
           </w:tcPr>
           <w:p>
             <w:r/>
@@ -1412,6 +1521,10 @@
         <w:pStyle w:val="Heading1"/>
       </w:pPr>
       <w:r>
+        <w:rPr>
+          <w:rFonts w:ascii="Calibri" w:hAnsi="Calibri"/>
+          <w:color w:val="1F3864"/>
+        </w:rPr>
         <w:t>7. Results Summary</w:t>
       </w:r>
     </w:p>
@@ -1425,6 +1538,14 @@
         <w:tblStyle w:val="TableGrid"/>
         <w:tblW w:type="auto" w:w="0"/>
         <w:tblLook w:firstColumn="1" w:firstRow="1" w:lastColumn="0" w:lastRow="0" w:noHBand="0" w:noVBand="1" w:val="04A0"/>
+        <w:tblBorders>
+          <w:top w:val="single" w:sz="4" w:space="0" w:color="C9D4E4"/>
+          <w:left w:val="single" w:sz="4" w:space="0" w:color="C9D4E4"/>
+          <w:bottom w:val="single" w:sz="4" w:space="0" w:color="C9D4E4"/>
+          <w:right w:val="single" w:sz="4" w:space="0" w:color="C9D4E4"/>
+          <w:insideH w:val="single" w:sz="4" w:space="0" w:color="C9D4E4"/>
+          <w:insideV w:val="single" w:sz="4" w:space="0" w:color="C9D4E4"/>
+        </w:tblBorders>
       </w:tblPr>
       <w:tblGrid>
         <w:gridCol w:w="1440"/>
@@ -1438,12 +1559,14 @@
         <w:tc>
           <w:tcPr>
             <w:tcW w:type="dxa" w:w="1440"/>
+            <w:shd w:val="clear" w:color="auto" w:fill="1F3864"/>
           </w:tcPr>
           <w:p>
             <w:r/>
             <w:r>
               <w:rPr>
                 <w:b/>
+                <w:color w:val="FFFFFF"/>
                 <w:sz w:val="18"/>
               </w:rPr>
               <w:t>Method</w:t>
@@ -1453,12 +1576,14 @@
         <w:tc>
           <w:tcPr>
             <w:tcW w:type="dxa" w:w="1440"/>
+            <w:shd w:val="clear" w:color="auto" w:fill="1F3864"/>
           </w:tcPr>
           <w:p>
             <w:r/>
             <w:r>
               <w:rPr>
                 <w:b/>
+                <w:color w:val="FFFFFF"/>
                 <w:sz w:val="18"/>
               </w:rPr>
               <w:t>Tokens/cert</w:t>
@@ -1468,12 +1593,14 @@
         <w:tc>
           <w:tcPr>
             <w:tcW w:type="dxa" w:w="1440"/>
+            <w:shd w:val="clear" w:color="auto" w:fill="1F3864"/>
           </w:tcPr>
           <w:p>
             <w:r/>
             <w:r>
               <w:rPr>
                 <w:b/>
+                <w:color w:val="FFFFFF"/>
                 <w:sz w:val="18"/>
               </w:rPr>
               <w:t>Tingkat</w:t>
@@ -1483,12 +1610,14 @@
         <w:tc>
           <w:tcPr>
             <w:tcW w:type="dxa" w:w="1440"/>
+            <w:shd w:val="clear" w:color="auto" w:fill="1F3864"/>
           </w:tcPr>
           <w:p>
             <w:r/>
             <w:r>
               <w:rPr>
                 <w:b/>
+                <w:color w:val="FFFFFF"/>
                 <w:sz w:val="18"/>
               </w:rPr>
               <w:t>MACRO exact</w:t>
@@ -1498,12 +1627,14 @@
         <w:tc>
           <w:tcPr>
             <w:tcW w:type="dxa" w:w="1440"/>
+            <w:shd w:val="clear" w:color="auto" w:fill="1F3864"/>
           </w:tcPr>
           <w:p>
             <w:r/>
             <w:r>
               <w:rPr>
                 <w:b/>
+                <w:color w:val="FFFFFF"/>
                 <w:sz w:val="18"/>
               </w:rPr>
               <w:t>Acc/token</w:t>
@@ -1513,12 +1644,14 @@
         <w:tc>
           <w:tcPr>
             <w:tcW w:type="dxa" w:w="1440"/>
+            <w:shd w:val="clear" w:color="auto" w:fill="1F3864"/>
           </w:tcPr>
           <w:p>
             <w:r/>
             <w:r>
               <w:rPr>
                 <w:b/>
+                <w:color w:val="FFFFFF"/>
                 <w:sz w:val="18"/>
               </w:rPr>
               <w:t>Latency</w:t>
@@ -1616,6 +1749,7 @@
         <w:tc>
           <w:tcPr>
             <w:tcW w:type="dxa" w:w="1440"/>
+            <w:shd w:val="clear" w:color="auto" w:fill="F2F6FC"/>
           </w:tcPr>
           <w:p>
             <w:r/>
@@ -1630,6 +1764,7 @@
         <w:tc>
           <w:tcPr>
             <w:tcW w:type="dxa" w:w="1440"/>
+            <w:shd w:val="clear" w:color="auto" w:fill="F2F6FC"/>
           </w:tcPr>
           <w:p>
             <w:r/>
@@ -1644,6 +1779,7 @@
         <w:tc>
           <w:tcPr>
             <w:tcW w:type="dxa" w:w="1440"/>
+            <w:shd w:val="clear" w:color="auto" w:fill="F2F6FC"/>
           </w:tcPr>
           <w:p>
             <w:r/>
@@ -1658,6 +1794,7 @@
         <w:tc>
           <w:tcPr>
             <w:tcW w:type="dxa" w:w="1440"/>
+            <w:shd w:val="clear" w:color="auto" w:fill="F2F6FC"/>
           </w:tcPr>
           <w:p>
             <w:r/>
@@ -1672,6 +1809,7 @@
         <w:tc>
           <w:tcPr>
             <w:tcW w:type="dxa" w:w="1440"/>
+            <w:shd w:val="clear" w:color="auto" w:fill="F2F6FC"/>
           </w:tcPr>
           <w:p>
             <w:r/>
@@ -1686,6 +1824,7 @@
         <w:tc>
           <w:tcPr>
             <w:tcW w:type="dxa" w:w="1440"/>
+            <w:shd w:val="clear" w:color="auto" w:fill="F2F6FC"/>
           </w:tcPr>
           <w:p>
             <w:r/>
@@ -1788,6 +1927,7 @@
         <w:tc>
           <w:tcPr>
             <w:tcW w:type="dxa" w:w="1440"/>
+            <w:shd w:val="clear" w:color="auto" w:fill="F2F6FC"/>
           </w:tcPr>
           <w:p>
             <w:r/>
@@ -1802,6 +1942,7 @@
         <w:tc>
           <w:tcPr>
             <w:tcW w:type="dxa" w:w="1440"/>
+            <w:shd w:val="clear" w:color="auto" w:fill="F2F6FC"/>
           </w:tcPr>
           <w:p>
             <w:r/>
@@ -1816,6 +1957,7 @@
         <w:tc>
           <w:tcPr>
             <w:tcW w:type="dxa" w:w="1440"/>
+            <w:shd w:val="clear" w:color="auto" w:fill="F2F6FC"/>
           </w:tcPr>
           <w:p>
             <w:r/>
@@ -1830,6 +1972,7 @@
         <w:tc>
           <w:tcPr>
             <w:tcW w:type="dxa" w:w="1440"/>
+            <w:shd w:val="clear" w:color="auto" w:fill="F2F6FC"/>
           </w:tcPr>
           <w:p>
             <w:r/>
@@ -1844,6 +1987,7 @@
         <w:tc>
           <w:tcPr>
             <w:tcW w:type="dxa" w:w="1440"/>
+            <w:shd w:val="clear" w:color="auto" w:fill="F2F6FC"/>
           </w:tcPr>
           <w:p>
             <w:r/>
@@ -1858,6 +2002,7 @@
         <w:tc>
           <w:tcPr>
             <w:tcW w:type="dxa" w:w="1440"/>
+            <w:shd w:val="clear" w:color="auto" w:fill="F2F6FC"/>
           </w:tcPr>
           <w:p>
             <w:r/>
@@ -1960,6 +2105,7 @@
         <w:tc>
           <w:tcPr>
             <w:tcW w:type="dxa" w:w="1440"/>
+            <w:shd w:val="clear" w:color="auto" w:fill="F2F6FC"/>
           </w:tcPr>
           <w:p>
             <w:r/>
@@ -1974,6 +2120,7 @@
         <w:tc>
           <w:tcPr>
             <w:tcW w:type="dxa" w:w="1440"/>
+            <w:shd w:val="clear" w:color="auto" w:fill="F2F6FC"/>
           </w:tcPr>
           <w:p>
             <w:r/>
@@ -1988,6 +2135,7 @@
         <w:tc>
           <w:tcPr>
             <w:tcW w:type="dxa" w:w="1440"/>
+            <w:shd w:val="clear" w:color="auto" w:fill="F2F6FC"/>
           </w:tcPr>
           <w:p>
             <w:r/>
@@ -2002,6 +2150,7 @@
         <w:tc>
           <w:tcPr>
             <w:tcW w:type="dxa" w:w="1440"/>
+            <w:shd w:val="clear" w:color="auto" w:fill="F2F6FC"/>
           </w:tcPr>
           <w:p>
             <w:r/>
@@ -2016,6 +2165,7 @@
         <w:tc>
           <w:tcPr>
             <w:tcW w:type="dxa" w:w="1440"/>
+            <w:shd w:val="clear" w:color="auto" w:fill="F2F6FC"/>
           </w:tcPr>
           <w:p>
             <w:r/>
@@ -2030,6 +2180,7 @@
         <w:tc>
           <w:tcPr>
             <w:tcW w:type="dxa" w:w="1440"/>
+            <w:shd w:val="clear" w:color="auto" w:fill="F2F6FC"/>
           </w:tcPr>
           <w:p>
             <w:r/>
@@ -2135,6 +2286,10 @@
         <w:pStyle w:val="Heading1"/>
       </w:pPr>
       <w:r>
+        <w:rPr>
+          <w:rFonts w:ascii="Calibri" w:hAnsi="Calibri"/>
+          <w:color w:val="1F3864"/>
+        </w:rPr>
         <w:t>8. Error Analysis</w:t>
       </w:r>
     </w:p>
@@ -2143,6 +2298,10 @@
         <w:pStyle w:val="Heading2"/>
       </w:pPr>
       <w:r>
+        <w:rPr>
+          <w:rFonts w:ascii="Calibri" w:hAnsi="Calibri"/>
+          <w:color w:val="2F5496"/>
+        </w:rPr>
         <w:t>8.1 Error Types</w:t>
       </w:r>
     </w:p>
@@ -2176,6 +2335,10 @@
         <w:pStyle w:val="Heading2"/>
       </w:pPr>
       <w:r>
+        <w:rPr>
+          <w:rFonts w:ascii="Calibri" w:hAnsi="Calibri"/>
+          <w:color w:val="2F5496"/>
+        </w:rPr>
         <w:t>8.2 Common Error Patterns</w:t>
       </w:r>
     </w:p>
@@ -2209,6 +2372,10 @@
         <w:pStyle w:val="Heading1"/>
       </w:pPr>
       <w:r>
+        <w:rPr>
+          <w:rFonts w:ascii="Calibri" w:hAnsi="Calibri"/>
+          <w:color w:val="1F3864"/>
+        </w:rPr>
         <w:t>9. Limitations and Caveats</w:t>
       </w:r>
     </w:p>
@@ -2252,6 +2419,10 @@
         <w:pStyle w:val="Heading1"/>
       </w:pPr>
       <w:r>
+        <w:rPr>
+          <w:rFonts w:ascii="Calibri" w:hAnsi="Calibri"/>
+          <w:color w:val="1F3864"/>
+        </w:rPr>
         <w:t>10. Handoff v7/v8 Evaluation Addendum</w:t>
       </w:r>
     </w:p>
@@ -2260,6 +2431,10 @@
         <w:pStyle w:val="Heading2"/>
       </w:pPr>
       <w:r>
+        <w:rPr>
+          <w:rFonts w:ascii="Calibri" w:hAnsi="Calibri"/>
+          <w:color w:val="2F5496"/>
+        </w:rPr>
         <w:t>10.1 Ground Truth Versioning</w:t>
       </w:r>
     </w:p>
@@ -2278,6 +2453,10 @@
         <w:pStyle w:val="Heading2"/>
       </w:pPr>
       <w:r>
+        <w:rPr>
+          <w:rFonts w:ascii="Calibri" w:hAnsi="Calibri"/>
+          <w:color w:val="2F5496"/>
+        </w:rPr>
         <w:t>10.2 Tingkat Scale-Evidence Check</w:t>
       </w:r>
     </w:p>
@@ -2291,6 +2470,10 @@
         <w:pStyle w:val="Heading2"/>
       </w:pPr>
       <w:r>
+        <w:rPr>
+          <w:rFonts w:ascii="Calibri" w:hAnsi="Calibri"/>
+          <w:color w:val="2F5496"/>
+        </w:rPr>
         <w:t>10.3 Router Precision and Call Reduction</w:t>
       </w:r>
     </w:p>
@@ -2299,6 +2482,14 @@
         <w:tblStyle w:val="TableGrid"/>
         <w:tblW w:type="auto" w:w="0"/>
         <w:tblLook w:firstColumn="1" w:firstRow="1" w:lastColumn="0" w:lastRow="0" w:noHBand="0" w:noVBand="1" w:val="04A0"/>
+        <w:tblBorders>
+          <w:top w:val="single" w:sz="4" w:space="0" w:color="C9D4E4"/>
+          <w:left w:val="single" w:sz="4" w:space="0" w:color="C9D4E4"/>
+          <w:bottom w:val="single" w:sz="4" w:space="0" w:color="C9D4E4"/>
+          <w:right w:val="single" w:sz="4" w:space="0" w:color="C9D4E4"/>
+          <w:insideH w:val="single" w:sz="4" w:space="0" w:color="C9D4E4"/>
+          <w:insideV w:val="single" w:sz="4" w:space="0" w:color="C9D4E4"/>
+        </w:tblBorders>
       </w:tblPr>
       <w:tblGrid>
         <w:gridCol w:w="2880"/>
@@ -2309,12 +2500,14 @@
         <w:tc>
           <w:tcPr>
             <w:tcW w:type="dxa" w:w="2880"/>
+            <w:shd w:val="clear" w:color="auto" w:fill="1F3864"/>
           </w:tcPr>
           <w:p>
             <w:r/>
             <w:r>
               <w:rPr>
                 <w:b/>
+                <w:color w:val="FFFFFF"/>
                 <w:sz w:val="18"/>
               </w:rPr>
               <w:t>Metric</w:t>
@@ -2324,12 +2517,14 @@
         <w:tc>
           <w:tcPr>
             <w:tcW w:type="dxa" w:w="2880"/>
+            <w:shd w:val="clear" w:color="auto" w:fill="1F3864"/>
           </w:tcPr>
           <w:p>
             <w:r/>
             <w:r>
               <w:rPr>
                 <w:b/>
+                <w:color w:val="FFFFFF"/>
                 <w:sz w:val="18"/>
               </w:rPr>
               <w:t>v7 (P4)</w:t>
@@ -2339,12 +2534,14 @@
         <w:tc>
           <w:tcPr>
             <w:tcW w:type="dxa" w:w="2880"/>
+            <w:shd w:val="clear" w:color="auto" w:fill="1F3864"/>
           </w:tcPr>
           <w:p>
             <w:r/>
             <w:r>
               <w:rPr>
                 <w:b/>
+                <w:color w:val="FFFFFF"/>
                 <w:sz w:val="18"/>
               </w:rPr>
               <w:t>v8</w:t>
@@ -2400,6 +2597,7 @@
         <w:tc>
           <w:tcPr>
             <w:tcW w:type="dxa" w:w="2880"/>
+            <w:shd w:val="clear" w:color="auto" w:fill="F2F6FC"/>
           </w:tcPr>
           <w:p>
             <w:r/>
@@ -2414,6 +2612,7 @@
         <w:tc>
           <w:tcPr>
             <w:tcW w:type="dxa" w:w="2880"/>
+            <w:shd w:val="clear" w:color="auto" w:fill="F2F6FC"/>
           </w:tcPr>
           <w:p>
             <w:r/>
@@ -2428,6 +2627,7 @@
         <w:tc>
           <w:tcPr>
             <w:tcW w:type="dxa" w:w="2880"/>
+            <w:shd w:val="clear" w:color="auto" w:fill="F2F6FC"/>
           </w:tcPr>
           <w:p>
             <w:r/>
@@ -2488,6 +2688,7 @@
         <w:tc>
           <w:tcPr>
             <w:tcW w:type="dxa" w:w="2880"/>
+            <w:shd w:val="clear" w:color="auto" w:fill="F2F6FC"/>
           </w:tcPr>
           <w:p>
             <w:r/>
@@ -2502,6 +2703,7 @@
         <w:tc>
           <w:tcPr>
             <w:tcW w:type="dxa" w:w="2880"/>
+            <w:shd w:val="clear" w:color="auto" w:fill="F2F6FC"/>
           </w:tcPr>
           <w:p>
             <w:r/>
@@ -2516,6 +2718,7 @@
         <w:tc>
           <w:tcPr>
             <w:tcW w:type="dxa" w:w="2880"/>
+            <w:shd w:val="clear" w:color="auto" w:fill="F2F6FC"/>
           </w:tcPr>
           <w:p>
             <w:r/>
@@ -2540,6 +2743,10 @@
         <w:pStyle w:val="Heading2"/>
       </w:pPr>
       <w:r>
+        <w:rPr>
+          <w:rFonts w:ascii="Calibri" w:hAnsi="Calibri"/>
+          <w:color w:val="2F5496"/>
+        </w:rPr>
         <w:t>10.4 Token Accounting</w:t>
       </w:r>
     </w:p>
@@ -2553,6 +2760,10 @@
         <w:pStyle w:val="Heading2"/>
       </w:pPr>
       <w:r>
+        <w:rPr>
+          <w:rFonts w:ascii="Calibri" w:hAnsi="Calibri"/>
+          <w:color w:val="2F5496"/>
+        </w:rPr>
         <w:t>10.5 Layout Representation Evaluation</w:t>
       </w:r>
     </w:p>
@@ -2566,6 +2777,10 @@
         <w:pStyle w:val="Heading2"/>
       </w:pPr>
       <w:r>
+        <w:rPr>
+          <w:rFonts w:ascii="Calibri" w:hAnsi="Calibri"/>
+          <w:color w:val="2F5496"/>
+        </w:rPr>
         <w:t>10.6 Final v8 Ship Gate</w:t>
       </w:r>
     </w:p>
@@ -2574,6 +2789,14 @@
         <w:tblStyle w:val="TableGrid"/>
         <w:tblW w:type="auto" w:w="0"/>
         <w:tblLook w:firstColumn="1" w:firstRow="1" w:lastColumn="0" w:lastRow="0" w:noHBand="0" w:noVBand="1" w:val="04A0"/>
+        <w:tblBorders>
+          <w:top w:val="single" w:sz="4" w:space="0" w:color="C9D4E4"/>
+          <w:left w:val="single" w:sz="4" w:space="0" w:color="C9D4E4"/>
+          <w:bottom w:val="single" w:sz="4" w:space="0" w:color="C9D4E4"/>
+          <w:right w:val="single" w:sz="4" w:space="0" w:color="C9D4E4"/>
+          <w:insideH w:val="single" w:sz="4" w:space="0" w:color="C9D4E4"/>
+          <w:insideV w:val="single" w:sz="4" w:space="0" w:color="C9D4E4"/>
+        </w:tblBorders>
       </w:tblPr>
       <w:tblGrid>
         <w:gridCol w:w="2160"/>
@@ -2585,12 +2808,14 @@
         <w:tc>
           <w:tcPr>
             <w:tcW w:type="dxa" w:w="2160"/>
+            <w:shd w:val="clear" w:color="auto" w:fill="1F3864"/>
           </w:tcPr>
           <w:p>
             <w:r/>
             <w:r>
               <w:rPr>
                 <w:b/>
+                <w:color w:val="FFFFFF"/>
                 <w:sz w:val="18"/>
               </w:rPr>
               <w:t>Metric</w:t>
@@ -2600,12 +2825,14 @@
         <w:tc>
           <w:tcPr>
             <w:tcW w:type="dxa" w:w="2160"/>
+            <w:shd w:val="clear" w:color="auto" w:fill="1F3864"/>
           </w:tcPr>
           <w:p>
             <w:r/>
             <w:r>
               <w:rPr>
                 <w:b/>
+                <w:color w:val="FFFFFF"/>
                 <w:sz w:val="18"/>
               </w:rPr>
               <w:t>Target</w:t>
@@ -2615,12 +2842,14 @@
         <w:tc>
           <w:tcPr>
             <w:tcW w:type="dxa" w:w="2160"/>
+            <w:shd w:val="clear" w:color="auto" w:fill="1F3864"/>
           </w:tcPr>
           <w:p>
             <w:r/>
             <w:r>
               <w:rPr>
                 <w:b/>
+                <w:color w:val="FFFFFF"/>
                 <w:sz w:val="18"/>
               </w:rPr>
               <w:t>Actual</w:t>
@@ -2630,12 +2859,14 @@
         <w:tc>
           <w:tcPr>
             <w:tcW w:type="dxa" w:w="2160"/>
+            <w:shd w:val="clear" w:color="auto" w:fill="1F3864"/>
           </w:tcPr>
           <w:p>
             <w:r/>
             <w:r>
               <w:rPr>
                 <w:b/>
+                <w:color w:val="FFFFFF"/>
                 <w:sz w:val="18"/>
               </w:rPr>
               <w:t>Status</w:t>
@@ -2705,6 +2936,7 @@
         <w:tc>
           <w:tcPr>
             <w:tcW w:type="dxa" w:w="2160"/>
+            <w:shd w:val="clear" w:color="auto" w:fill="F2F6FC"/>
           </w:tcPr>
           <w:p>
             <w:r/>
@@ -2719,6 +2951,7 @@
         <w:tc>
           <w:tcPr>
             <w:tcW w:type="dxa" w:w="2160"/>
+            <w:shd w:val="clear" w:color="auto" w:fill="F2F6FC"/>
           </w:tcPr>
           <w:p>
             <w:r/>
@@ -2733,6 +2966,7 @@
         <w:tc>
           <w:tcPr>
             <w:tcW w:type="dxa" w:w="2160"/>
+            <w:shd w:val="clear" w:color="auto" w:fill="F2F6FC"/>
           </w:tcPr>
           <w:p>
             <w:r/>
@@ -2747,6 +2981,7 @@
         <w:tc>
           <w:tcPr>
             <w:tcW w:type="dxa" w:w="2160"/>
+            <w:shd w:val="clear" w:color="auto" w:fill="F2F6FC"/>
           </w:tcPr>
           <w:p>
             <w:r/>
@@ -2821,6 +3056,7 @@
         <w:tc>
           <w:tcPr>
             <w:tcW w:type="dxa" w:w="2160"/>
+            <w:shd w:val="clear" w:color="auto" w:fill="F2F6FC"/>
           </w:tcPr>
           <w:p>
             <w:r/>
@@ -2835,6 +3071,7 @@
         <w:tc>
           <w:tcPr>
             <w:tcW w:type="dxa" w:w="2160"/>
+            <w:shd w:val="clear" w:color="auto" w:fill="F2F6FC"/>
           </w:tcPr>
           <w:p>
             <w:r/>
@@ -2849,6 +3086,7 @@
         <w:tc>
           <w:tcPr>
             <w:tcW w:type="dxa" w:w="2160"/>
+            <w:shd w:val="clear" w:color="auto" w:fill="F2F6FC"/>
           </w:tcPr>
           <w:p>
             <w:r/>
@@ -2863,6 +3101,7 @@
         <w:tc>
           <w:tcPr>
             <w:tcW w:type="dxa" w:w="2160"/>
+            <w:shd w:val="clear" w:color="auto" w:fill="F2F6FC"/>
           </w:tcPr>
           <w:p>
             <w:r/>
@@ -2937,6 +3176,7 @@
         <w:tc>
           <w:tcPr>
             <w:tcW w:type="dxa" w:w="2160"/>
+            <w:shd w:val="clear" w:color="auto" w:fill="F2F6FC"/>
           </w:tcPr>
           <w:p>
             <w:r/>
@@ -2951,6 +3191,7 @@
         <w:tc>
           <w:tcPr>
             <w:tcW w:type="dxa" w:w="2160"/>
+            <w:shd w:val="clear" w:color="auto" w:fill="F2F6FC"/>
           </w:tcPr>
           <w:p>
             <w:r/>
@@ -2965,6 +3206,7 @@
         <w:tc>
           <w:tcPr>
             <w:tcW w:type="dxa" w:w="2160"/>
+            <w:shd w:val="clear" w:color="auto" w:fill="F2F6FC"/>
           </w:tcPr>
           <w:p>
             <w:r/>
@@ -2979,6 +3221,7 @@
         <w:tc>
           <w:tcPr>
             <w:tcW w:type="dxa" w:w="2160"/>
+            <w:shd w:val="clear" w:color="auto" w:fill="F2F6FC"/>
           </w:tcPr>
           <w:p>
             <w:r/>
@@ -3061,6 +3304,10 @@
         <w:pStyle w:val="Heading2"/>
       </w:pPr>
       <w:r>
+        <w:rPr>
+          <w:rFonts w:ascii="Calibri" w:hAnsi="Calibri"/>
+          <w:color w:val="2F5496"/>
+        </w:rPr>
         <w:t>10.7 Results Summary (experiments)</w:t>
       </w:r>
     </w:p>
@@ -3069,6 +3316,14 @@
         <w:tblStyle w:val="TableGrid"/>
         <w:tblW w:type="auto" w:w="0"/>
         <w:tblLook w:firstColumn="1" w:firstRow="1" w:lastColumn="0" w:lastRow="0" w:noHBand="0" w:noVBand="1" w:val="04A0"/>
+        <w:tblBorders>
+          <w:top w:val="single" w:sz="4" w:space="0" w:color="C9D4E4"/>
+          <w:left w:val="single" w:sz="4" w:space="0" w:color="C9D4E4"/>
+          <w:bottom w:val="single" w:sz="4" w:space="0" w:color="C9D4E4"/>
+          <w:right w:val="single" w:sz="4" w:space="0" w:color="C9D4E4"/>
+          <w:insideH w:val="single" w:sz="4" w:space="0" w:color="C9D4E4"/>
+          <w:insideV w:val="single" w:sz="4" w:space="0" w:color="C9D4E4"/>
+        </w:tblBorders>
       </w:tblPr>
       <w:tblGrid>
         <w:gridCol w:w="1234"/>
@@ -3083,12 +3338,14 @@
         <w:tc>
           <w:tcPr>
             <w:tcW w:type="dxa" w:w="1234"/>
+            <w:shd w:val="clear" w:color="auto" w:fill="1F3864"/>
           </w:tcPr>
           <w:p>
             <w:r/>
             <w:r>
               <w:rPr>
                 <w:b/>
+                <w:color w:val="FFFFFF"/>
                 <w:sz w:val="18"/>
               </w:rPr>
               <w:t>Experiment</w:t>
@@ -3098,12 +3355,14 @@
         <w:tc>
           <w:tcPr>
             <w:tcW w:type="dxa" w:w="1234"/>
+            <w:shd w:val="clear" w:color="auto" w:fill="1F3864"/>
           </w:tcPr>
           <w:p>
             <w:r/>
             <w:r>
               <w:rPr>
                 <w:b/>
+                <w:color w:val="FFFFFF"/>
                 <w:sz w:val="18"/>
               </w:rPr>
               <w:t>Tingkat exact</w:t>
@@ -3113,12 +3372,14 @@
         <w:tc>
           <w:tcPr>
             <w:tcW w:type="dxa" w:w="1234"/>
+            <w:shd w:val="clear" w:color="auto" w:fill="1F3864"/>
           </w:tcPr>
           <w:p>
             <w:r/>
             <w:r>
               <w:rPr>
                 <w:b/>
+                <w:color w:val="FFFFFF"/>
                 <w:sz w:val="18"/>
               </w:rPr>
               <w:t>MACRO exact</w:t>
@@ -3128,12 +3389,14 @@
         <w:tc>
           <w:tcPr>
             <w:tcW w:type="dxa" w:w="1234"/>
+            <w:shd w:val="clear" w:color="auto" w:fill="1F3864"/>
           </w:tcPr>
           <w:p>
             <w:r/>
             <w:r>
               <w:rPr>
                 <w:b/>
+                <w:color w:val="FFFFFF"/>
                 <w:sz w:val="18"/>
               </w:rPr>
               <w:t>Eff tok/cert</w:t>
@@ -3143,12 +3406,14 @@
         <w:tc>
           <w:tcPr>
             <w:tcW w:type="dxa" w:w="1234"/>
+            <w:shd w:val="clear" w:color="auto" w:fill="1F3864"/>
           </w:tcPr>
           <w:p>
             <w:r/>
             <w:r>
               <w:rPr>
                 <w:b/>
+                <w:color w:val="FFFFFF"/>
                 <w:sz w:val="18"/>
               </w:rPr>
               <w:t>LLM calls</w:t>
@@ -3158,12 +3423,14 @@
         <w:tc>
           <w:tcPr>
             <w:tcW w:type="dxa" w:w="1234"/>
+            <w:shd w:val="clear" w:color="auto" w:fill="1F3864"/>
           </w:tcPr>
           <w:p>
             <w:r/>
             <w:r>
               <w:rPr>
                 <w:b/>
+                <w:color w:val="FFFFFF"/>
                 <w:sz w:val="18"/>
               </w:rPr>
               <w:t>Router</w:t>
@@ -3173,12 +3440,14 @@
         <w:tc>
           <w:tcPr>
             <w:tcW w:type="dxa" w:w="1234"/>
+            <w:shd w:val="clear" w:color="auto" w:fill="1F3864"/>
           </w:tcPr>
           <w:p>
             <w:r/>
             <w:r>
               <w:rPr>
                 <w:b/>
+                <w:color w:val="FFFFFF"/>
                 <w:sz w:val="18"/>
               </w:rPr>
               <w:t>GT</w:t>
@@ -3290,6 +3559,7 @@
         <w:tc>
           <w:tcPr>
             <w:tcW w:type="dxa" w:w="1234"/>
+            <w:shd w:val="clear" w:color="auto" w:fill="F2F6FC"/>
           </w:tcPr>
           <w:p>
             <w:r/>
@@ -3304,6 +3574,7 @@
         <w:tc>
           <w:tcPr>
             <w:tcW w:type="dxa" w:w="1234"/>
+            <w:shd w:val="clear" w:color="auto" w:fill="F2F6FC"/>
           </w:tcPr>
           <w:p>
             <w:r/>
@@ -3318,6 +3589,7 @@
         <w:tc>
           <w:tcPr>
             <w:tcW w:type="dxa" w:w="1234"/>
+            <w:shd w:val="clear" w:color="auto" w:fill="F2F6FC"/>
           </w:tcPr>
           <w:p>
             <w:r/>
@@ -3332,6 +3604,7 @@
         <w:tc>
           <w:tcPr>
             <w:tcW w:type="dxa" w:w="1234"/>
+            <w:shd w:val="clear" w:color="auto" w:fill="F2F6FC"/>
           </w:tcPr>
           <w:p>
             <w:r/>
@@ -3346,6 +3619,7 @@
         <w:tc>
           <w:tcPr>
             <w:tcW w:type="dxa" w:w="1234"/>
+            <w:shd w:val="clear" w:color="auto" w:fill="F2F6FC"/>
           </w:tcPr>
           <w:p>
             <w:r/>
@@ -3360,6 +3634,7 @@
         <w:tc>
           <w:tcPr>
             <w:tcW w:type="dxa" w:w="1234"/>
+            <w:shd w:val="clear" w:color="auto" w:fill="F2F6FC"/>
           </w:tcPr>
           <w:p>
             <w:r/>
@@ -3374,6 +3649,7 @@
         <w:tc>
           <w:tcPr>
             <w:tcW w:type="dxa" w:w="1234"/>
+            <w:shd w:val="clear" w:color="auto" w:fill="F2F6FC"/>
           </w:tcPr>
           <w:p>
             <w:r/>
@@ -3490,6 +3766,7 @@
         <w:tc>
           <w:tcPr>
             <w:tcW w:type="dxa" w:w="1234"/>
+            <w:shd w:val="clear" w:color="auto" w:fill="F2F6FC"/>
           </w:tcPr>
           <w:p>
             <w:r/>
@@ -3504,6 +3781,7 @@
         <w:tc>
           <w:tcPr>
             <w:tcW w:type="dxa" w:w="1234"/>
+            <w:shd w:val="clear" w:color="auto" w:fill="F2F6FC"/>
           </w:tcPr>
           <w:p>
             <w:r/>
@@ -3518,6 +3796,7 @@
         <w:tc>
           <w:tcPr>
             <w:tcW w:type="dxa" w:w="1234"/>
+            <w:shd w:val="clear" w:color="auto" w:fill="F2F6FC"/>
           </w:tcPr>
           <w:p>
             <w:r/>
@@ -3532,6 +3811,7 @@
         <w:tc>
           <w:tcPr>
             <w:tcW w:type="dxa" w:w="1234"/>
+            <w:shd w:val="clear" w:color="auto" w:fill="F2F6FC"/>
           </w:tcPr>
           <w:p>
             <w:r/>
@@ -3546,6 +3826,7 @@
         <w:tc>
           <w:tcPr>
             <w:tcW w:type="dxa" w:w="1234"/>
+            <w:shd w:val="clear" w:color="auto" w:fill="F2F6FC"/>
           </w:tcPr>
           <w:p>
             <w:r/>
@@ -3560,6 +3841,7 @@
         <w:tc>
           <w:tcPr>
             <w:tcW w:type="dxa" w:w="1234"/>
+            <w:shd w:val="clear" w:color="auto" w:fill="F2F6FC"/>
           </w:tcPr>
           <w:p>
             <w:r/>
@@ -3574,6 +3856,7 @@
         <w:tc>
           <w:tcPr>
             <w:tcW w:type="dxa" w:w="1234"/>
+            <w:shd w:val="clear" w:color="auto" w:fill="F2F6FC"/>
           </w:tcPr>
           <w:p>
             <w:r/>
@@ -3690,6 +3973,7 @@
         <w:tc>
           <w:tcPr>
             <w:tcW w:type="dxa" w:w="1234"/>
+            <w:shd w:val="clear" w:color="auto" w:fill="F2F6FC"/>
           </w:tcPr>
           <w:p>
             <w:r/>
@@ -3704,6 +3988,7 @@
         <w:tc>
           <w:tcPr>
             <w:tcW w:type="dxa" w:w="1234"/>
+            <w:shd w:val="clear" w:color="auto" w:fill="F2F6FC"/>
           </w:tcPr>
           <w:p>
             <w:r/>
@@ -3718,6 +4003,7 @@
         <w:tc>
           <w:tcPr>
             <w:tcW w:type="dxa" w:w="1234"/>
+            <w:shd w:val="clear" w:color="auto" w:fill="F2F6FC"/>
           </w:tcPr>
           <w:p>
             <w:r/>
@@ -3732,6 +4018,7 @@
         <w:tc>
           <w:tcPr>
             <w:tcW w:type="dxa" w:w="1234"/>
+            <w:shd w:val="clear" w:color="auto" w:fill="F2F6FC"/>
           </w:tcPr>
           <w:p>
             <w:r/>
@@ -3746,6 +4033,7 @@
         <w:tc>
           <w:tcPr>
             <w:tcW w:type="dxa" w:w="1234"/>
+            <w:shd w:val="clear" w:color="auto" w:fill="F2F6FC"/>
           </w:tcPr>
           <w:p>
             <w:r/>
@@ -3760,6 +4048,7 @@
         <w:tc>
           <w:tcPr>
             <w:tcW w:type="dxa" w:w="1234"/>
+            <w:shd w:val="clear" w:color="auto" w:fill="F2F6FC"/>
           </w:tcPr>
           <w:p>
             <w:r/>
@@ -3774,6 +4063,7 @@
         <w:tc>
           <w:tcPr>
             <w:tcW w:type="dxa" w:w="1234"/>
+            <w:shd w:val="clear" w:color="auto" w:fill="F2F6FC"/>
           </w:tcPr>
           <w:p>
             <w:r/>
@@ -3890,6 +4180,7 @@
         <w:tc>
           <w:tcPr>
             <w:tcW w:type="dxa" w:w="1234"/>
+            <w:shd w:val="clear" w:color="auto" w:fill="F2F6FC"/>
           </w:tcPr>
           <w:p>
             <w:r/>
@@ -3904,6 +4195,7 @@
         <w:tc>
           <w:tcPr>
             <w:tcW w:type="dxa" w:w="1234"/>
+            <w:shd w:val="clear" w:color="auto" w:fill="F2F6FC"/>
           </w:tcPr>
           <w:p>
             <w:r/>
@@ -3918,6 +4210,7 @@
         <w:tc>
           <w:tcPr>
             <w:tcW w:type="dxa" w:w="1234"/>
+            <w:shd w:val="clear" w:color="auto" w:fill="F2F6FC"/>
           </w:tcPr>
           <w:p>
             <w:r/>
@@ -3932,6 +4225,7 @@
         <w:tc>
           <w:tcPr>
             <w:tcW w:type="dxa" w:w="1234"/>
+            <w:shd w:val="clear" w:color="auto" w:fill="F2F6FC"/>
           </w:tcPr>
           <w:p>
             <w:r/>
@@ -3946,6 +4240,7 @@
         <w:tc>
           <w:tcPr>
             <w:tcW w:type="dxa" w:w="1234"/>
+            <w:shd w:val="clear" w:color="auto" w:fill="F2F6FC"/>
           </w:tcPr>
           <w:p>
             <w:r/>
@@ -3960,6 +4255,7 @@
         <w:tc>
           <w:tcPr>
             <w:tcW w:type="dxa" w:w="1234"/>
+            <w:shd w:val="clear" w:color="auto" w:fill="F2F6FC"/>
           </w:tcPr>
           <w:p>
             <w:r/>
@@ -3974,6 +4270,7 @@
         <w:tc>
           <w:tcPr>
             <w:tcW w:type="dxa" w:w="1234"/>
+            <w:shd w:val="clear" w:color="auto" w:fill="F2F6FC"/>
           </w:tcPr>
           <w:p>
             <w:r/>
@@ -4082,6 +4379,527 @@
                 <w:sz w:val="18"/>
               </w:rPr>
               <w:t>fixed_v8</w:t>
+            </w:r>
+          </w:p>
+        </w:tc>
+      </w:tr>
+      <w:tr>
+        <w:tc>
+          <w:tcPr>
+            <w:tcW w:type="dxa" w:w="1234"/>
+            <w:shd w:val="clear" w:color="auto" w:fill="F2F6FC"/>
+          </w:tcPr>
+          <w:p>
+            <w:r/>
+            <w:r>
+              <w:rPr>
+                <w:sz w:val="18"/>
+              </w:rPr>
+              <w:t>v9 organizer_v2 + router fix</w:t>
+            </w:r>
+          </w:p>
+        </w:tc>
+        <w:tc>
+          <w:tcPr>
+            <w:tcW w:type="dxa" w:w="1234"/>
+            <w:shd w:val="clear" w:color="auto" w:fill="F2F6FC"/>
+          </w:tcPr>
+          <w:p>
+            <w:r/>
+            <w:r>
+              <w:rPr>
+                <w:sz w:val="18"/>
+              </w:rPr>
+              <w:t>83.8%</w:t>
+            </w:r>
+          </w:p>
+        </w:tc>
+        <w:tc>
+          <w:tcPr>
+            <w:tcW w:type="dxa" w:w="1234"/>
+            <w:shd w:val="clear" w:color="auto" w:fill="F2F6FC"/>
+          </w:tcPr>
+          <w:p>
+            <w:r/>
+            <w:r>
+              <w:rPr>
+                <w:sz w:val="18"/>
+              </w:rPr>
+              <w:t>58.9%</w:t>
+            </w:r>
+          </w:p>
+        </w:tc>
+        <w:tc>
+          <w:tcPr>
+            <w:tcW w:type="dxa" w:w="1234"/>
+            <w:shd w:val="clear" w:color="auto" w:fill="F2F6FC"/>
+          </w:tcPr>
+          <w:p>
+            <w:r/>
+            <w:r>
+              <w:rPr>
+                <w:sz w:val="18"/>
+              </w:rPr>
+              <w:t>176</w:t>
+            </w:r>
+          </w:p>
+        </w:tc>
+        <w:tc>
+          <w:tcPr>
+            <w:tcW w:type="dxa" w:w="1234"/>
+            <w:shd w:val="clear" w:color="auto" w:fill="F2F6FC"/>
+          </w:tcPr>
+          <w:p>
+            <w:r/>
+            <w:r>
+              <w:rPr>
+                <w:sz w:val="18"/>
+              </w:rPr>
+              <w:t>29</w:t>
+            </w:r>
+          </w:p>
+        </w:tc>
+        <w:tc>
+          <w:tcPr>
+            <w:tcW w:type="dxa" w:w="1234"/>
+            <w:shd w:val="clear" w:color="auto" w:fill="F2F6FC"/>
+          </w:tcPr>
+          <w:p>
+            <w:r/>
+            <w:r>
+              <w:rPr>
+                <w:sz w:val="18"/>
+              </w:rPr>
+              <w:t>42/74 @100%</w:t>
+            </w:r>
+          </w:p>
+        </w:tc>
+        <w:tc>
+          <w:tcPr>
+            <w:tcW w:type="dxa" w:w="1234"/>
+            <w:shd w:val="clear" w:color="auto" w:fill="F2F6FC"/>
+          </w:tcPr>
+          <w:p>
+            <w:r/>
+            <w:r>
+              <w:rPr>
+                <w:sz w:val="18"/>
+              </w:rPr>
+              <w:t>v8</w:t>
+            </w:r>
+          </w:p>
+        </w:tc>
+      </w:tr>
+      <w:tr>
+        <w:tc>
+          <w:tcPr>
+            <w:tcW w:type="dxa" w:w="1234"/>
+          </w:tcPr>
+          <w:p>
+            <w:r/>
+            <w:r>
+              <w:rPr>
+                <w:sz w:val="18"/>
+              </w:rPr>
+              <w:t>v9 winner re-baseline (GT v9 + matcher v2)</w:t>
+            </w:r>
+          </w:p>
+        </w:tc>
+        <w:tc>
+          <w:tcPr>
+            <w:tcW w:type="dxa" w:w="1234"/>
+          </w:tcPr>
+          <w:p>
+            <w:r/>
+            <w:r>
+              <w:rPr>
+                <w:sz w:val="18"/>
+              </w:rPr>
+              <w:t>83.8%</w:t>
+            </w:r>
+          </w:p>
+        </w:tc>
+        <w:tc>
+          <w:tcPr>
+            <w:tcW w:type="dxa" w:w="1234"/>
+          </w:tcPr>
+          <w:p>
+            <w:r/>
+            <w:r>
+              <w:rPr>
+                <w:sz w:val="18"/>
+              </w:rPr>
+              <w:t>60.2%</w:t>
+            </w:r>
+          </w:p>
+        </w:tc>
+        <w:tc>
+          <w:tcPr>
+            <w:tcW w:type="dxa" w:w="1234"/>
+          </w:tcPr>
+          <w:p>
+            <w:r/>
+            <w:r>
+              <w:rPr>
+                <w:sz w:val="18"/>
+              </w:rPr>
+              <w:t>176</w:t>
+            </w:r>
+          </w:p>
+        </w:tc>
+        <w:tc>
+          <w:tcPr>
+            <w:tcW w:type="dxa" w:w="1234"/>
+          </w:tcPr>
+          <w:p>
+            <w:r/>
+            <w:r>
+              <w:rPr>
+                <w:sz w:val="18"/>
+              </w:rPr>
+              <w:t>29</w:t>
+            </w:r>
+          </w:p>
+        </w:tc>
+        <w:tc>
+          <w:tcPr>
+            <w:tcW w:type="dxa" w:w="1234"/>
+          </w:tcPr>
+          <w:p>
+            <w:r/>
+            <w:r>
+              <w:rPr>
+                <w:sz w:val="18"/>
+              </w:rPr>
+              <w:t>42/74 @100%</w:t>
+            </w:r>
+          </w:p>
+        </w:tc>
+        <w:tc>
+          <w:tcPr>
+            <w:tcW w:type="dxa" w:w="1234"/>
+          </w:tcPr>
+          <w:p>
+            <w:r/>
+            <w:r>
+              <w:rPr>
+                <w:sz w:val="18"/>
+              </w:rPr>
+              <w:t>v9</w:t>
+            </w:r>
+          </w:p>
+        </w:tc>
+      </w:tr>
+      <w:tr>
+        <w:tc>
+          <w:tcPr>
+            <w:tcW w:type="dxa" w:w="1234"/>
+            <w:shd w:val="clear" w:color="auto" w:fill="F2F6FC"/>
+          </w:tcPr>
+          <w:p>
+            <w:r/>
+            <w:r>
+              <w:rPr>
+                <w:sz w:val="18"/>
+              </w:rPr>
+              <w:t>NC-001 nomor crop preprocessing (re-render region zoom 6x)</w:t>
+            </w:r>
+          </w:p>
+        </w:tc>
+        <w:tc>
+          <w:tcPr>
+            <w:tcW w:type="dxa" w:w="1234"/>
+            <w:shd w:val="clear" w:color="auto" w:fill="F2F6FC"/>
+          </w:tcPr>
+          <w:p>
+            <w:r/>
+            <w:r>
+              <w:rPr>
+                <w:sz w:val="18"/>
+              </w:rPr>
+              <w:t>n/a</w:t>
+            </w:r>
+          </w:p>
+        </w:tc>
+        <w:tc>
+          <w:tcPr>
+            <w:tcW w:type="dxa" w:w="1234"/>
+            <w:shd w:val="clear" w:color="auto" w:fill="F2F6FC"/>
+          </w:tcPr>
+          <w:p>
+            <w:r/>
+            <w:r>
+              <w:rPr>
+                <w:sz w:val="18"/>
+              </w:rPr>
+              <w:t>46.3%</w:t>
+            </w:r>
+          </w:p>
+        </w:tc>
+        <w:tc>
+          <w:tcPr>
+            <w:tcW w:type="dxa" w:w="1234"/>
+            <w:shd w:val="clear" w:color="auto" w:fill="F2F6FC"/>
+          </w:tcPr>
+          <w:p>
+            <w:r/>
+            <w:r>
+              <w:rPr>
+                <w:sz w:val="18"/>
+              </w:rPr>
+              <w:t>0</w:t>
+            </w:r>
+          </w:p>
+        </w:tc>
+        <w:tc>
+          <w:tcPr>
+            <w:tcW w:type="dxa" w:w="1234"/>
+            <w:shd w:val="clear" w:color="auto" w:fill="F2F6FC"/>
+          </w:tcPr>
+          <w:p>
+            <w:r/>
+            <w:r>
+              <w:rPr>
+                <w:sz w:val="18"/>
+              </w:rPr>
+              <w:t>0</w:t>
+            </w:r>
+          </w:p>
+        </w:tc>
+        <w:tc>
+          <w:tcPr>
+            <w:tcW w:type="dxa" w:w="1234"/>
+            <w:shd w:val="clear" w:color="auto" w:fill="F2F6FC"/>
+          </w:tcPr>
+          <w:p>
+            <w:r/>
+            <w:r>
+              <w:rPr>
+                <w:sz w:val="18"/>
+              </w:rPr>
+              <w:t>-</w:t>
+            </w:r>
+          </w:p>
+        </w:tc>
+        <w:tc>
+          <w:tcPr>
+            <w:tcW w:type="dxa" w:w="1234"/>
+            <w:shd w:val="clear" w:color="auto" w:fill="F2F6FC"/>
+          </w:tcPr>
+          <w:p>
+            <w:r/>
+            <w:r>
+              <w:rPr>
+                <w:sz w:val="18"/>
+              </w:rPr>
+              <w:t>v9</w:t>
+            </w:r>
+          </w:p>
+        </w:tc>
+      </w:tr>
+      <w:tr>
+        <w:tc>
+          <w:tcPr>
+            <w:tcW w:type="dxa" w:w="1234"/>
+          </w:tcPr>
+          <w:p>
+            <w:r/>
+            <w:r>
+              <w:rPr>
+                <w:sz w:val="18"/>
+              </w:rPr>
+              <w:t>OCR-006 DocTR probe (mobilenet CPU, 10 scan)</w:t>
+            </w:r>
+          </w:p>
+        </w:tc>
+        <w:tc>
+          <w:tcPr>
+            <w:tcW w:type="dxa" w:w="1234"/>
+          </w:tcPr>
+          <w:p>
+            <w:r/>
+            <w:r>
+              <w:rPr>
+                <w:sz w:val="18"/>
+              </w:rPr>
+              <w:t>n/a</w:t>
+            </w:r>
+          </w:p>
+        </w:tc>
+        <w:tc>
+          <w:tcPr>
+            <w:tcW w:type="dxa" w:w="1234"/>
+          </w:tcPr>
+          <w:p>
+            <w:r/>
+            <w:r>
+              <w:rPr>
+                <w:sz w:val="18"/>
+              </w:rPr>
+              <w:t>40.0%</w:t>
+            </w:r>
+          </w:p>
+        </w:tc>
+        <w:tc>
+          <w:tcPr>
+            <w:tcW w:type="dxa" w:w="1234"/>
+          </w:tcPr>
+          <w:p>
+            <w:r/>
+            <w:r>
+              <w:rPr>
+                <w:sz w:val="18"/>
+              </w:rPr>
+              <w:t>0</w:t>
+            </w:r>
+          </w:p>
+        </w:tc>
+        <w:tc>
+          <w:tcPr>
+            <w:tcW w:type="dxa" w:w="1234"/>
+          </w:tcPr>
+          <w:p>
+            <w:r/>
+            <w:r>
+              <w:rPr>
+                <w:sz w:val="18"/>
+              </w:rPr>
+              <w:t>0</w:t>
+            </w:r>
+          </w:p>
+        </w:tc>
+        <w:tc>
+          <w:tcPr>
+            <w:tcW w:type="dxa" w:w="1234"/>
+          </w:tcPr>
+          <w:p>
+            <w:r/>
+            <w:r>
+              <w:rPr>
+                <w:sz w:val="18"/>
+              </w:rPr>
+              <w:t>-</w:t>
+            </w:r>
+          </w:p>
+        </w:tc>
+        <w:tc>
+          <w:tcPr>
+            <w:tcW w:type="dxa" w:w="1234"/>
+          </w:tcPr>
+          <w:p>
+            <w:r/>
+            <w:r>
+              <w:rPr>
+                <w:sz w:val="18"/>
+              </w:rPr>
+              <w:t>v9</w:t>
+            </w:r>
+          </w:p>
+        </w:tc>
+      </w:tr>
+      <w:tr>
+        <w:tc>
+          <w:tcPr>
+            <w:tcW w:type="dxa" w:w="1234"/>
+            <w:shd w:val="clear" w:color="auto" w:fill="F2F6FC"/>
+          </w:tcPr>
+          <w:p>
+            <w:r/>
+            <w:r>
+              <w:rPr>
+                <w:sz w:val="18"/>
+              </w:rPr>
+              <w:t>HYB-001 hybrid OCR per-field (DocTR dates+organizer / baseline nomor)</w:t>
+            </w:r>
+          </w:p>
+        </w:tc>
+        <w:tc>
+          <w:tcPr>
+            <w:tcW w:type="dxa" w:w="1234"/>
+            <w:shd w:val="clear" w:color="auto" w:fill="F2F6FC"/>
+          </w:tcPr>
+          <w:p>
+            <w:r/>
+            <w:r>
+              <w:rPr>
+                <w:sz w:val="18"/>
+              </w:rPr>
+              <w:t>n/a</w:t>
+            </w:r>
+          </w:p>
+        </w:tc>
+        <w:tc>
+          <w:tcPr>
+            <w:tcW w:type="dxa" w:w="1234"/>
+            <w:shd w:val="clear" w:color="auto" w:fill="F2F6FC"/>
+          </w:tcPr>
+          <w:p>
+            <w:r/>
+            <w:r>
+              <w:rPr>
+                <w:sz w:val="18"/>
+              </w:rPr>
+              <w:t>46.8%</w:t>
+            </w:r>
+          </w:p>
+        </w:tc>
+        <w:tc>
+          <w:tcPr>
+            <w:tcW w:type="dxa" w:w="1234"/>
+            <w:shd w:val="clear" w:color="auto" w:fill="F2F6FC"/>
+          </w:tcPr>
+          <w:p>
+            <w:r/>
+            <w:r>
+              <w:rPr>
+                <w:sz w:val="18"/>
+              </w:rPr>
+              <w:t>0</w:t>
+            </w:r>
+          </w:p>
+        </w:tc>
+        <w:tc>
+          <w:tcPr>
+            <w:tcW w:type="dxa" w:w="1234"/>
+            <w:shd w:val="clear" w:color="auto" w:fill="F2F6FC"/>
+          </w:tcPr>
+          <w:p>
+            <w:r/>
+            <w:r>
+              <w:rPr>
+                <w:sz w:val="18"/>
+              </w:rPr>
+              <w:t>0</w:t>
+            </w:r>
+          </w:p>
+        </w:tc>
+        <w:tc>
+          <w:tcPr>
+            <w:tcW w:type="dxa" w:w="1234"/>
+            <w:shd w:val="clear" w:color="auto" w:fill="F2F6FC"/>
+          </w:tcPr>
+          <w:p>
+            <w:r/>
+            <w:r>
+              <w:rPr>
+                <w:sz w:val="18"/>
+              </w:rPr>
+              <w:t>-</w:t>
+            </w:r>
+          </w:p>
+        </w:tc>
+        <w:tc>
+          <w:tcPr>
+            <w:tcW w:type="dxa" w:w="1234"/>
+            <w:shd w:val="clear" w:color="auto" w:fill="F2F6FC"/>
+          </w:tcPr>
+          <w:p>
+            <w:r/>
+            <w:r>
+              <w:rPr>
+                <w:sz w:val="18"/>
+              </w:rPr>
+              <w:t>v9</w:t>
             </w:r>
           </w:p>
         </w:tc>

</xml_diff>

<commit_message>
docs(report): tambah 24 eksperimen dari ledger ke report_data.json (24→48 total) + regenerate
Eksperimen baru ditambahkan:
- LLM-001 (g_evidence) + LLM-002 (layout): v8 prompt variants
- ROUTER-001..003: naive FAIL, data-driven PASS, dept/luar PASS
- ORG-001 (organizer_v2) + ORG-005 (probe scoring FAIL)
- F3-001 + KB-001..006: KB prototype, shadow, seeded, norm, audit, event, alias
- KB-SCALE-001..005: workload, race, map, conf, e2e
- KB-PROD-001: servable/resolve/audit_due
- OOD-001, STAT-001, REVIEW-001
- AKT-001 (taksonomi nama_kegiatan)

Semua dari experiments_ledger.md, diurutkan kronologis (Jul 30→Aug 14).
regenerate: benchmark_methods + evaluation_methodology (docx+md),
phase_v4_results_summary.md.

files:
- docs/report/report_data.json: +24 entries, re-sort chronological
- docs/report/{benchmark_methods,evaluation_methodology}.{docx,md}: regenerate
- docs/report/phase_v4_results_summary.md: regenerate
- scripts/update_report_data.py: idempotent script utk add missing entries
</commit_message>
<xml_diff>
--- a/docs/report/evaluation_methodology.docx
+++ b/docs/report/evaluation_methodology.docx
@@ -3981,7 +3981,7 @@
               <w:rPr>
                 <w:sz w:val="18"/>
               </w:rPr>
-              <w:t>v8 f_bias + router</w:t>
+              <w:t>LLM-001 g_evidence prompt (minta bukti sebelum jawaban)</w:t>
             </w:r>
           </w:p>
         </w:tc>
@@ -3996,7 +3996,7 @@
               <w:rPr>
                 <w:sz w:val="18"/>
               </w:rPr>
-              <w:t>82.4%</w:t>
+              <w:t>75.7%</w:t>
             </w:r>
           </w:p>
         </w:tc>
@@ -4011,7 +4011,7 @@
               <w:rPr>
                 <w:sz w:val="18"/>
               </w:rPr>
-              <w:t>55.2%</w:t>
+              <w:t>53.9%</w:t>
             </w:r>
           </w:p>
         </w:tc>
@@ -4026,7 +4026,7 @@
               <w:rPr>
                 <w:sz w:val="18"/>
               </w:rPr>
-              <w:t>214</w:t>
+              <w:t>194</w:t>
             </w:r>
           </w:p>
         </w:tc>
@@ -4056,7 +4056,7 @@
               <w:rPr>
                 <w:sz w:val="18"/>
               </w:rPr>
-              <w:t>39/74 @100%</w:t>
+              <w:t>-</w:t>
             </w:r>
           </w:p>
         </w:tc>
@@ -4087,63 +4087,63 @@
               <w:rPr>
                 <w:sz w:val="18"/>
               </w:rPr>
-              <w:t>OCR Trial A — PaddleOCR 2.9 (CPU)</w:t>
-            </w:r>
-          </w:p>
-        </w:tc>
-        <w:tc>
-          <w:tcPr>
-            <w:tcW w:type="dxa" w:w="1234"/>
-          </w:tcPr>
-          <w:p>
-            <w:r/>
-            <w:r>
-              <w:rPr>
-                <w:sz w:val="18"/>
-              </w:rPr>
-              <w:t>n/a</w:t>
-            </w:r>
-          </w:p>
-        </w:tc>
-        <w:tc>
-          <w:tcPr>
-            <w:tcW w:type="dxa" w:w="1234"/>
-          </w:tcPr>
-          <w:p>
-            <w:r/>
-            <w:r>
-              <w:rPr>
-                <w:sz w:val="18"/>
-              </w:rPr>
-              <w:t>39.8%</w:t>
-            </w:r>
-          </w:p>
-        </w:tc>
-        <w:tc>
-          <w:tcPr>
-            <w:tcW w:type="dxa" w:w="1234"/>
-          </w:tcPr>
-          <w:p>
-            <w:r/>
-            <w:r>
-              <w:rPr>
-                <w:sz w:val="18"/>
-              </w:rPr>
-              <w:t>0</w:t>
-            </w:r>
-          </w:p>
-        </w:tc>
-        <w:tc>
-          <w:tcPr>
-            <w:tcW w:type="dxa" w:w="1234"/>
-          </w:tcPr>
-          <w:p>
-            <w:r/>
-            <w:r>
-              <w:rPr>
-                <w:sz w:val="18"/>
-              </w:rPr>
-              <w:t>0</w:t>
+              <w:t>LLM-002 layout representation (markdown/annotation ke prompt)</w:t>
+            </w:r>
+          </w:p>
+        </w:tc>
+        <w:tc>
+          <w:tcPr>
+            <w:tcW w:type="dxa" w:w="1234"/>
+          </w:tcPr>
+          <w:p>
+            <w:r/>
+            <w:r>
+              <w:rPr>
+                <w:sz w:val="18"/>
+              </w:rPr>
+              <w:t>77.0%</w:t>
+            </w:r>
+          </w:p>
+        </w:tc>
+        <w:tc>
+          <w:tcPr>
+            <w:tcW w:type="dxa" w:w="1234"/>
+          </w:tcPr>
+          <w:p>
+            <w:r/>
+            <w:r>
+              <w:rPr>
+                <w:sz w:val="18"/>
+              </w:rPr>
+              <w:t>50.8%</w:t>
+            </w:r>
+          </w:p>
+        </w:tc>
+        <w:tc>
+          <w:tcPr>
+            <w:tcW w:type="dxa" w:w="1234"/>
+          </w:tcPr>
+          <w:p>
+            <w:r/>
+            <w:r>
+              <w:rPr>
+                <w:sz w:val="18"/>
+              </w:rPr>
+              <w:t>235</w:t>
+            </w:r>
+          </w:p>
+        </w:tc>
+        <w:tc>
+          <w:tcPr>
+            <w:tcW w:type="dxa" w:w="1234"/>
+          </w:tcPr>
+          <w:p>
+            <w:r/>
+            <w:r>
+              <w:rPr>
+                <w:sz w:val="18"/>
+              </w:rPr>
+              <w:t>39</w:t>
             </w:r>
           </w:p>
         </w:tc>
@@ -4188,7 +4188,7 @@
               <w:rPr>
                 <w:sz w:val="18"/>
               </w:rPr>
-              <w:t>OCR Trial A — EasyOCR (CPU, max-side 960)</w:t>
+              <w:t>ROUTER-001 naive rule expansion (univ, hima, fak patterns)</w:t>
             </w:r>
           </w:p>
         </w:tc>
@@ -4203,7 +4203,7 @@
               <w:rPr>
                 <w:sz w:val="18"/>
               </w:rPr>
-              <w:t>n/a</w:t>
+              <w:t>-</w:t>
             </w:r>
           </w:p>
         </w:tc>
@@ -4218,7 +4218,7 @@
               <w:rPr>
                 <w:sz w:val="18"/>
               </w:rPr>
-              <w:t>34.3%</w:t>
+              <w:t>54.2%</w:t>
             </w:r>
           </w:p>
         </w:tc>
@@ -4294,77 +4294,77 @@
               <w:rPr>
                 <w:sz w:val="18"/>
               </w:rPr>
-              <w:t>OCR Trial A — EasyOCR (GPU, full-res)</w:t>
-            </w:r>
-          </w:p>
-        </w:tc>
-        <w:tc>
-          <w:tcPr>
-            <w:tcW w:type="dxa" w:w="1234"/>
-          </w:tcPr>
-          <w:p>
-            <w:r/>
-            <w:r>
-              <w:rPr>
-                <w:sz w:val="18"/>
-              </w:rPr>
-              <w:t>n/a</w:t>
-            </w:r>
-          </w:p>
-        </w:tc>
-        <w:tc>
-          <w:tcPr>
-            <w:tcW w:type="dxa" w:w="1234"/>
-          </w:tcPr>
-          <w:p>
-            <w:r/>
-            <w:r>
-              <w:rPr>
-                <w:sz w:val="18"/>
-              </w:rPr>
-              <w:t>39.3%</w:t>
-            </w:r>
-          </w:p>
-        </w:tc>
-        <w:tc>
-          <w:tcPr>
-            <w:tcW w:type="dxa" w:w="1234"/>
-          </w:tcPr>
-          <w:p>
-            <w:r/>
-            <w:r>
-              <w:rPr>
-                <w:sz w:val="18"/>
-              </w:rPr>
-              <w:t>0</w:t>
-            </w:r>
-          </w:p>
-        </w:tc>
-        <w:tc>
-          <w:tcPr>
-            <w:tcW w:type="dxa" w:w="1234"/>
-          </w:tcPr>
-          <w:p>
-            <w:r/>
-            <w:r>
-              <w:rPr>
-                <w:sz w:val="18"/>
-              </w:rPr>
-              <w:t>0</w:t>
-            </w:r>
-          </w:p>
-        </w:tc>
-        <w:tc>
-          <w:tcPr>
-            <w:tcW w:type="dxa" w:w="1234"/>
-          </w:tcPr>
-          <w:p>
-            <w:r/>
-            <w:r>
-              <w:rPr>
-                <w:sz w:val="18"/>
-              </w:rPr>
-              <w:t>-</w:t>
+              <w:t>v8 f_bias + router</w:t>
+            </w:r>
+          </w:p>
+        </w:tc>
+        <w:tc>
+          <w:tcPr>
+            <w:tcW w:type="dxa" w:w="1234"/>
+          </w:tcPr>
+          <w:p>
+            <w:r/>
+            <w:r>
+              <w:rPr>
+                <w:sz w:val="18"/>
+              </w:rPr>
+              <w:t>82.4%</w:t>
+            </w:r>
+          </w:p>
+        </w:tc>
+        <w:tc>
+          <w:tcPr>
+            <w:tcW w:type="dxa" w:w="1234"/>
+          </w:tcPr>
+          <w:p>
+            <w:r/>
+            <w:r>
+              <w:rPr>
+                <w:sz w:val="18"/>
+              </w:rPr>
+              <w:t>55.2%</w:t>
+            </w:r>
+          </w:p>
+        </w:tc>
+        <w:tc>
+          <w:tcPr>
+            <w:tcW w:type="dxa" w:w="1234"/>
+          </w:tcPr>
+          <w:p>
+            <w:r/>
+            <w:r>
+              <w:rPr>
+                <w:sz w:val="18"/>
+              </w:rPr>
+              <w:t>214</w:t>
+            </w:r>
+          </w:p>
+        </w:tc>
+        <w:tc>
+          <w:tcPr>
+            <w:tcW w:type="dxa" w:w="1234"/>
+          </w:tcPr>
+          <w:p>
+            <w:r/>
+            <w:r>
+              <w:rPr>
+                <w:sz w:val="18"/>
+              </w:rPr>
+              <w:t>35</w:t>
+            </w:r>
+          </w:p>
+        </w:tc>
+        <w:tc>
+          <w:tcPr>
+            <w:tcW w:type="dxa" w:w="1234"/>
+          </w:tcPr>
+          <w:p>
+            <w:r/>
+            <w:r>
+              <w:rPr>
+                <w:sz w:val="18"/>
+              </w:rPr>
+              <w:t>39/74 @100%</w:t>
             </w:r>
           </w:p>
         </w:tc>
@@ -4395,7 +4395,7 @@
               <w:rPr>
                 <w:sz w:val="18"/>
               </w:rPr>
-              <w:t>v9 organizer_v2 + router fix</w:t>
+              <w:t>ROUTER-002 data-driven rules (bem_no_univ, bem+hima, sem+univ)</w:t>
             </w:r>
           </w:p>
         </w:tc>
@@ -4470,7 +4470,7 @@
               <w:rPr>
                 <w:sz w:val="18"/>
               </w:rPr>
-              <w:t>45/74 @100%</w:t>
+              <w:t>42/74 @100%</w:t>
             </w:r>
           </w:p>
         </w:tc>
@@ -4485,7 +4485,7 @@
               <w:rPr>
                 <w:sz w:val="18"/>
               </w:rPr>
-              <w:t>v8</w:t>
+              <w:t>fixed_v8</w:t>
             </w:r>
           </w:p>
         </w:tc>
@@ -4501,7 +4501,7 @@
               <w:rPr>
                 <w:sz w:val="18"/>
               </w:rPr>
-              <w:t>v9 winner re-baseline (GT v9 + matcher v2)</w:t>
+              <w:t>ROUTER-003 dept/luar signal fix (raw_text OR organizer)</w:t>
             </w:r>
           </w:p>
         </w:tc>
@@ -4529,7 +4529,7 @@
               <w:rPr>
                 <w:sz w:val="18"/>
               </w:rPr>
-              <w:t>60.2%</w:t>
+              <w:t>58.9%</w:t>
             </w:r>
           </w:p>
         </w:tc>
@@ -4585,7 +4585,7 @@
               <w:rPr>
                 <w:sz w:val="18"/>
               </w:rPr>
-              <w:t>v9</w:t>
+              <w:t>fixed_v8</w:t>
             </w:r>
           </w:p>
         </w:tc>
@@ -4602,7 +4602,7 @@
               <w:rPr>
                 <w:sz w:val="18"/>
               </w:rPr>
-              <w:t>NC-001 nomor crop preprocessing (re-render region zoom 6x)</w:t>
+              <w:t>OCR Trial A — EasyOCR (CPU, max-side 960)</w:t>
             </w:r>
           </w:p>
         </w:tc>
@@ -4632,7 +4632,7 @@
               <w:rPr>
                 <w:sz w:val="18"/>
               </w:rPr>
-              <w:t>46.3%</w:t>
+              <w:t>34.3%</w:t>
             </w:r>
           </w:p>
         </w:tc>
@@ -4692,7 +4692,7 @@
               <w:rPr>
                 <w:sz w:val="18"/>
               </w:rPr>
-              <w:t>v9</w:t>
+              <w:t>fixed_v8</w:t>
             </w:r>
           </w:p>
         </w:tc>
@@ -4708,7 +4708,7 @@
               <w:rPr>
                 <w:sz w:val="18"/>
               </w:rPr>
-              <w:t>OCR-006 DocTR probe (mobilenet CPU, 10 scan)</w:t>
+              <w:t>OCR Trial A — EasyOCR (GPU, full-res)</w:t>
             </w:r>
           </w:p>
         </w:tc>
@@ -4736,7 +4736,7 @@
               <w:rPr>
                 <w:sz w:val="18"/>
               </w:rPr>
-              <w:t>40.0%</w:t>
+              <w:t>39.3%</w:t>
             </w:r>
           </w:p>
         </w:tc>
@@ -4792,7 +4792,7 @@
               <w:rPr>
                 <w:sz w:val="18"/>
               </w:rPr>
-              <w:t>v9</w:t>
+              <w:t>fixed_v8</w:t>
             </w:r>
           </w:p>
         </w:tc>
@@ -4809,7 +4809,7 @@
               <w:rPr>
                 <w:sz w:val="18"/>
               </w:rPr>
-              <w:t>OCR-007 LFM2.5-VL-3B probe (VLM OCR, GGUF Q4_0 + mmproj Q8_0, 10 scan)</w:t>
+              <w:t>OCR Trial A — PaddleOCR 2.9 (CPU)</w:t>
             </w:r>
           </w:p>
         </w:tc>
@@ -4839,7 +4839,7 @@
               <w:rPr>
                 <w:sz w:val="18"/>
               </w:rPr>
-              <w:t>44.4%</w:t>
+              <w:t>39.8%</w:t>
             </w:r>
           </w:p>
         </w:tc>
@@ -4899,7 +4899,7 @@
               <w:rPr>
                 <w:sz w:val="18"/>
               </w:rPr>
-              <w:t>v9</w:t>
+              <w:t>fixed_v8</w:t>
             </w:r>
           </w:p>
         </w:tc>
@@ -4915,91 +4915,91 @@
               <w:rPr>
                 <w:sz w:val="18"/>
               </w:rPr>
-              <w:t>HYB-001 hybrid OCR per-field (DocTR dates+organizer / baseline nomor)</w:t>
-            </w:r>
-          </w:p>
-        </w:tc>
-        <w:tc>
-          <w:tcPr>
-            <w:tcW w:type="dxa" w:w="1234"/>
-          </w:tcPr>
-          <w:p>
-            <w:r/>
-            <w:r>
-              <w:rPr>
-                <w:sz w:val="18"/>
-              </w:rPr>
-              <w:t>n/a</w:t>
-            </w:r>
-          </w:p>
-        </w:tc>
-        <w:tc>
-          <w:tcPr>
-            <w:tcW w:type="dxa" w:w="1234"/>
-          </w:tcPr>
-          <w:p>
-            <w:r/>
-            <w:r>
-              <w:rPr>
-                <w:sz w:val="18"/>
-              </w:rPr>
-              <w:t>46.8%</w:t>
-            </w:r>
-          </w:p>
-        </w:tc>
-        <w:tc>
-          <w:tcPr>
-            <w:tcW w:type="dxa" w:w="1234"/>
-          </w:tcPr>
-          <w:p>
-            <w:r/>
-            <w:r>
-              <w:rPr>
-                <w:sz w:val="18"/>
-              </w:rPr>
-              <w:t>0</w:t>
-            </w:r>
-          </w:p>
-        </w:tc>
-        <w:tc>
-          <w:tcPr>
-            <w:tcW w:type="dxa" w:w="1234"/>
-          </w:tcPr>
-          <w:p>
-            <w:r/>
-            <w:r>
-              <w:rPr>
-                <w:sz w:val="18"/>
-              </w:rPr>
-              <w:t>0</w:t>
-            </w:r>
-          </w:p>
-        </w:tc>
-        <w:tc>
-          <w:tcPr>
-            <w:tcW w:type="dxa" w:w="1234"/>
-          </w:tcPr>
-          <w:p>
-            <w:r/>
-            <w:r>
-              <w:rPr>
-                <w:sz w:val="18"/>
-              </w:rPr>
-              <w:t>-</w:t>
-            </w:r>
-          </w:p>
-        </w:tc>
-        <w:tc>
-          <w:tcPr>
-            <w:tcW w:type="dxa" w:w="1234"/>
-          </w:tcPr>
-          <w:p>
-            <w:r/>
-            <w:r>
-              <w:rPr>
-                <w:sz w:val="18"/>
-              </w:rPr>
-              <w:t>v9</w:t>
+              <w:t>ORG-001 organizer_v2 (abbreviation map, strip, signer EN roles)</w:t>
+            </w:r>
+          </w:p>
+        </w:tc>
+        <w:tc>
+          <w:tcPr>
+            <w:tcW w:type="dxa" w:w="1234"/>
+          </w:tcPr>
+          <w:p>
+            <w:r/>
+            <w:r>
+              <w:rPr>
+                <w:sz w:val="18"/>
+              </w:rPr>
+              <w:t>83.8%</w:t>
+            </w:r>
+          </w:p>
+        </w:tc>
+        <w:tc>
+          <w:tcPr>
+            <w:tcW w:type="dxa" w:w="1234"/>
+          </w:tcPr>
+          <w:p>
+            <w:r/>
+            <w:r>
+              <w:rPr>
+                <w:sz w:val="18"/>
+              </w:rPr>
+              <w:t>58.9%</w:t>
+            </w:r>
+          </w:p>
+        </w:tc>
+        <w:tc>
+          <w:tcPr>
+            <w:tcW w:type="dxa" w:w="1234"/>
+          </w:tcPr>
+          <w:p>
+            <w:r/>
+            <w:r>
+              <w:rPr>
+                <w:sz w:val="18"/>
+              </w:rPr>
+              <w:t>176</w:t>
+            </w:r>
+          </w:p>
+        </w:tc>
+        <w:tc>
+          <w:tcPr>
+            <w:tcW w:type="dxa" w:w="1234"/>
+          </w:tcPr>
+          <w:p>
+            <w:r/>
+            <w:r>
+              <w:rPr>
+                <w:sz w:val="18"/>
+              </w:rPr>
+              <w:t>29</w:t>
+            </w:r>
+          </w:p>
+        </w:tc>
+        <w:tc>
+          <w:tcPr>
+            <w:tcW w:type="dxa" w:w="1234"/>
+          </w:tcPr>
+          <w:p>
+            <w:r/>
+            <w:r>
+              <w:rPr>
+                <w:sz w:val="18"/>
+              </w:rPr>
+              <w:t>45/74 @100%</w:t>
+            </w:r>
+          </w:p>
+        </w:tc>
+        <w:tc>
+          <w:tcPr>
+            <w:tcW w:type="dxa" w:w="1234"/>
+          </w:tcPr>
+          <w:p>
+            <w:r/>
+            <w:r>
+              <w:rPr>
+                <w:sz w:val="18"/>
+              </w:rPr>
+              <w:t>v8</w:t>
             </w:r>
           </w:p>
         </w:tc>
@@ -5016,7 +5016,7 @@
               <w:rPr>
                 <w:sz w:val="18"/>
               </w:rPr>
-              <w:t>NC-002 region-OCR murah (rapid / tess psm tunggal) utk 2-pass nomor</w:t>
+              <w:t>v9 organizer_v2 + router fix</w:t>
             </w:r>
           </w:p>
         </w:tc>
@@ -5031,7 +5031,7 @@
               <w:rPr>
                 <w:sz w:val="18"/>
               </w:rPr>
-              <w:t>n/a</w:t>
+              <w:t>83.8%</w:t>
             </w:r>
           </w:p>
         </w:tc>
@@ -5046,7 +5046,7 @@
               <w:rPr>
                 <w:sz w:val="18"/>
               </w:rPr>
-              <w:t>47.3%</w:t>
+              <w:t>58.9%</w:t>
             </w:r>
           </w:p>
         </w:tc>
@@ -5061,7 +5061,7 @@
               <w:rPr>
                 <w:sz w:val="18"/>
               </w:rPr>
-              <w:t>0</w:t>
+              <w:t>176</w:t>
             </w:r>
           </w:p>
         </w:tc>
@@ -5076,7 +5076,7 @@
               <w:rPr>
                 <w:sz w:val="18"/>
               </w:rPr>
-              <w:t>0</w:t>
+              <w:t>29</w:t>
             </w:r>
           </w:p>
         </w:tc>
@@ -5091,7 +5091,7 @@
               <w:rPr>
                 <w:sz w:val="18"/>
               </w:rPr>
-              <w:t>-</w:t>
+              <w:t>45/74 @100%</w:t>
             </w:r>
           </w:p>
         </w:tc>
@@ -5106,7 +5106,7 @@
               <w:rPr>
                 <w:sz w:val="18"/>
               </w:rPr>
-              <w:t>v9</w:t>
+              <w:t>v8</w:t>
             </w:r>
           </w:p>
         </w:tc>
@@ -5122,77 +5122,77 @@
               <w:rPr>
                 <w:sz w:val="18"/>
               </w:rPr>
-              <w:t>F1 organizer v3 + R6 (0 LLM)</w:t>
-            </w:r>
-          </w:p>
-        </w:tc>
-        <w:tc>
-          <w:tcPr>
-            <w:tcW w:type="dxa" w:w="1234"/>
-          </w:tcPr>
-          <w:p>
-            <w:r/>
-            <w:r>
-              <w:rPr>
-                <w:sz w:val="18"/>
-              </w:rPr>
-              <w:t>81.1%</w:t>
-            </w:r>
-          </w:p>
-        </w:tc>
-        <w:tc>
-          <w:tcPr>
-            <w:tcW w:type="dxa" w:w="1234"/>
-          </w:tcPr>
-          <w:p>
-            <w:r/>
-            <w:r>
-              <w:rPr>
-                <w:sz w:val="18"/>
-              </w:rPr>
-              <w:t>61.2%</w:t>
-            </w:r>
-          </w:p>
-        </w:tc>
-        <w:tc>
-          <w:tcPr>
-            <w:tcW w:type="dxa" w:w="1234"/>
-          </w:tcPr>
-          <w:p>
-            <w:r/>
-            <w:r>
-              <w:rPr>
-                <w:sz w:val="18"/>
-              </w:rPr>
-              <w:t>0</w:t>
-            </w:r>
-          </w:p>
-        </w:tc>
-        <w:tc>
-          <w:tcPr>
-            <w:tcW w:type="dxa" w:w="1234"/>
-          </w:tcPr>
-          <w:p>
-            <w:r/>
-            <w:r>
-              <w:rPr>
-                <w:sz w:val="18"/>
-              </w:rPr>
-              <w:t>0</w:t>
-            </w:r>
-          </w:p>
-        </w:tc>
-        <w:tc>
-          <w:tcPr>
-            <w:tcW w:type="dxa" w:w="1234"/>
-          </w:tcPr>
-          <w:p>
-            <w:r/>
-            <w:r>
-              <w:rPr>
-                <w:sz w:val="18"/>
-              </w:rPr>
-              <w:t>-</w:t>
+              <w:t>v9 winner re-baseline (GT v9 + matcher v2)</w:t>
+            </w:r>
+          </w:p>
+        </w:tc>
+        <w:tc>
+          <w:tcPr>
+            <w:tcW w:type="dxa" w:w="1234"/>
+          </w:tcPr>
+          <w:p>
+            <w:r/>
+            <w:r>
+              <w:rPr>
+                <w:sz w:val="18"/>
+              </w:rPr>
+              <w:t>83.8%</w:t>
+            </w:r>
+          </w:p>
+        </w:tc>
+        <w:tc>
+          <w:tcPr>
+            <w:tcW w:type="dxa" w:w="1234"/>
+          </w:tcPr>
+          <w:p>
+            <w:r/>
+            <w:r>
+              <w:rPr>
+                <w:sz w:val="18"/>
+              </w:rPr>
+              <w:t>60.2%</w:t>
+            </w:r>
+          </w:p>
+        </w:tc>
+        <w:tc>
+          <w:tcPr>
+            <w:tcW w:type="dxa" w:w="1234"/>
+          </w:tcPr>
+          <w:p>
+            <w:r/>
+            <w:r>
+              <w:rPr>
+                <w:sz w:val="18"/>
+              </w:rPr>
+              <w:t>176</w:t>
+            </w:r>
+          </w:p>
+        </w:tc>
+        <w:tc>
+          <w:tcPr>
+            <w:tcW w:type="dxa" w:w="1234"/>
+          </w:tcPr>
+          <w:p>
+            <w:r/>
+            <w:r>
+              <w:rPr>
+                <w:sz w:val="18"/>
+              </w:rPr>
+              <w:t>29</w:t>
+            </w:r>
+          </w:p>
+        </w:tc>
+        <w:tc>
+          <w:tcPr>
+            <w:tcW w:type="dxa" w:w="1234"/>
+          </w:tcPr>
+          <w:p>
+            <w:r/>
+            <w:r>
+              <w:rPr>
+                <w:sz w:val="18"/>
+              </w:rPr>
+              <w:t>45/74 @100%</w:t>
             </w:r>
           </w:p>
         </w:tc>
@@ -5223,7 +5223,7 @@
               <w:rPr>
                 <w:sz w:val="18"/>
               </w:rPr>
-              <w:t>F1 normalisasi organizer &amp; nomor (0 LLM)</w:t>
+              <w:t>HYB-001 hybrid OCR per-field (DocTR dates+organizer / baseline nomor)</w:t>
             </w:r>
           </w:p>
         </w:tc>
@@ -5238,7 +5238,7 @@
               <w:rPr>
                 <w:sz w:val="18"/>
               </w:rPr>
-              <w:t>81.1%</w:t>
+              <w:t>n/a</w:t>
             </w:r>
           </w:p>
         </w:tc>
@@ -5253,7 +5253,7 @@
               <w:rPr>
                 <w:sz w:val="18"/>
               </w:rPr>
-              <w:t>58.3%</w:t>
+              <w:t>46.8%</w:t>
             </w:r>
           </w:p>
         </w:tc>
@@ -5329,35 +5329,35 @@
               <w:rPr>
                 <w:sz w:val="18"/>
               </w:rPr>
-              <w:t>ORG-004 canonicalisasi format (0 LLM)</w:t>
-            </w:r>
-          </w:p>
-        </w:tc>
-        <w:tc>
-          <w:tcPr>
-            <w:tcW w:type="dxa" w:w="1234"/>
-          </w:tcPr>
-          <w:p>
-            <w:r/>
-            <w:r>
-              <w:rPr>
-                <w:sz w:val="18"/>
-              </w:rPr>
-              <w:t>81.1%</w:t>
-            </w:r>
-          </w:p>
-        </w:tc>
-        <w:tc>
-          <w:tcPr>
-            <w:tcW w:type="dxa" w:w="1234"/>
-          </w:tcPr>
-          <w:p>
-            <w:r/>
-            <w:r>
-              <w:rPr>
-                <w:sz w:val="18"/>
-              </w:rPr>
-              <w:t>63.5%</w:t>
+              <w:t>NC-001 nomor crop preprocessing (re-render region zoom 6x)</w:t>
+            </w:r>
+          </w:p>
+        </w:tc>
+        <w:tc>
+          <w:tcPr>
+            <w:tcW w:type="dxa" w:w="1234"/>
+          </w:tcPr>
+          <w:p>
+            <w:r/>
+            <w:r>
+              <w:rPr>
+                <w:sz w:val="18"/>
+              </w:rPr>
+              <w:t>n/a</w:t>
+            </w:r>
+          </w:p>
+        </w:tc>
+        <w:tc>
+          <w:tcPr>
+            <w:tcW w:type="dxa" w:w="1234"/>
+          </w:tcPr>
+          <w:p>
+            <w:r/>
+            <w:r>
+              <w:rPr>
+                <w:sz w:val="18"/>
+              </w:rPr>
+              <w:t>46.3%</w:t>
             </w:r>
           </w:p>
         </w:tc>
@@ -5430,7 +5430,7 @@
               <w:rPr>
                 <w:sz w:val="18"/>
               </w:rPr>
-              <w:t>PROD-002 port produksi organizer v3+R3+R6+format + nomor (flag-gated)</w:t>
+              <w:t>NC-002 region-OCR murah (rapid / tess psm tunggal) utk 2-pass nomor</w:t>
             </w:r>
           </w:p>
         </w:tc>
@@ -5445,7 +5445,7 @@
               <w:rPr>
                 <w:sz w:val="18"/>
               </w:rPr>
-              <w:t>81.1%</w:t>
+              <w:t>n/a</w:t>
             </w:r>
           </w:p>
         </w:tc>
@@ -5460,7 +5460,7 @@
               <w:rPr>
                 <w:sz w:val="18"/>
               </w:rPr>
-              <w:t>63.0%</w:t>
+              <w:t>47.3%</w:t>
             </w:r>
           </w:p>
         </w:tc>
@@ -5536,35 +5536,35 @@
               <w:rPr>
                 <w:sz w:val="18"/>
               </w:rPr>
-              <w:t>AKT-002 deteksi nama_kegiatan v2 (0 LLM)</w:t>
-            </w:r>
-          </w:p>
-        </w:tc>
-        <w:tc>
-          <w:tcPr>
-            <w:tcW w:type="dxa" w:w="1234"/>
-          </w:tcPr>
-          <w:p>
-            <w:r/>
-            <w:r>
-              <w:rPr>
-                <w:sz w:val="18"/>
-              </w:rPr>
-              <w:t>81.1%</w:t>
-            </w:r>
-          </w:p>
-        </w:tc>
-        <w:tc>
-          <w:tcPr>
-            <w:tcW w:type="dxa" w:w="1234"/>
-          </w:tcPr>
-          <w:p>
-            <w:r/>
-            <w:r>
-              <w:rPr>
-                <w:sz w:val="18"/>
-              </w:rPr>
-              <w:t>68.8%</w:t>
+              <w:t>OCR-006 DocTR probe (mobilenet CPU, 10 scan)</w:t>
+            </w:r>
+          </w:p>
+        </w:tc>
+        <w:tc>
+          <w:tcPr>
+            <w:tcW w:type="dxa" w:w="1234"/>
+          </w:tcPr>
+          <w:p>
+            <w:r/>
+            <w:r>
+              <w:rPr>
+                <w:sz w:val="18"/>
+              </w:rPr>
+              <w:t>n/a</w:t>
+            </w:r>
+          </w:p>
+        </w:tc>
+        <w:tc>
+          <w:tcPr>
+            <w:tcW w:type="dxa" w:w="1234"/>
+          </w:tcPr>
+          <w:p>
+            <w:r/>
+            <w:r>
+              <w:rPr>
+                <w:sz w:val="18"/>
+              </w:rPr>
+              <w:t>40.0%</w:t>
             </w:r>
           </w:p>
         </w:tc>
@@ -5637,7 +5637,7 @@
               <w:rPr>
                 <w:sz w:val="18"/>
               </w:rPr>
-              <w:t>AKT-003 deteksi nama_kegiatan v3: Sebagai Peserta + atthe/inthe (0 LLM)</w:t>
+              <w:t>F3-001 KB prototype warmup in-memory (opsi B, key=organizer+role)</w:t>
             </w:r>
           </w:p>
         </w:tc>
@@ -5652,7 +5652,7 @@
               <w:rPr>
                 <w:sz w:val="18"/>
               </w:rPr>
-              <w:t>81.1%</w:t>
+              <w:t>84.4%</w:t>
             </w:r>
           </w:p>
         </w:tc>
@@ -5667,7 +5667,7 @@
               <w:rPr>
                 <w:sz w:val="18"/>
               </w:rPr>
-              <w:t>71.6%</w:t>
+              <w:t>-</w:t>
             </w:r>
           </w:p>
         </w:tc>
@@ -5697,7 +5697,7 @@
               <w:rPr>
                 <w:sz w:val="18"/>
               </w:rPr>
-              <w:t>0</w:t>
+              <w:t>29</w:t>
             </w:r>
           </w:p>
         </w:tc>
@@ -5743,35 +5743,35 @@
               <w:rPr>
                 <w:sz w:val="18"/>
               </w:rPr>
-              <w:t>AKT-004 deteksi nama_kegiatan v4: Event/lomba/seminar on (0 LLM, gate scope-kecil)</w:t>
-            </w:r>
-          </w:p>
-        </w:tc>
-        <w:tc>
-          <w:tcPr>
-            <w:tcW w:type="dxa" w:w="1234"/>
-          </w:tcPr>
-          <w:p>
-            <w:r/>
-            <w:r>
-              <w:rPr>
-                <w:sz w:val="18"/>
-              </w:rPr>
-              <w:t>81.1%</w:t>
-            </w:r>
-          </w:p>
-        </w:tc>
-        <w:tc>
-          <w:tcPr>
-            <w:tcW w:type="dxa" w:w="1234"/>
-          </w:tcPr>
-          <w:p>
-            <w:r/>
-            <w:r>
-              <w:rPr>
-                <w:sz w:val="18"/>
-              </w:rPr>
-              <w:t>72.1%</w:t>
+              <w:t>OOD-001 probe mutation + noise (template &amp; OCR noise injection)</w:t>
+            </w:r>
+          </w:p>
+        </w:tc>
+        <w:tc>
+          <w:tcPr>
+            <w:tcW w:type="dxa" w:w="1234"/>
+          </w:tcPr>
+          <w:p>
+            <w:r/>
+            <w:r>
+              <w:rPr>
+                <w:sz w:val="18"/>
+              </w:rPr>
+              <w:t>83.8%</w:t>
+            </w:r>
+          </w:p>
+        </w:tc>
+        <w:tc>
+          <w:tcPr>
+            <w:tcW w:type="dxa" w:w="1234"/>
+          </w:tcPr>
+          <w:p>
+            <w:r/>
+            <w:r>
+              <w:rPr>
+                <w:sz w:val="18"/>
+              </w:rPr>
+              <w:t>55.7%</w:t>
             </w:r>
           </w:p>
         </w:tc>
@@ -5844,6 +5844,1869 @@
               <w:rPr>
                 <w:sz w:val="18"/>
               </w:rPr>
+              <w:t>F1 normalisasi organizer &amp; nomor (0 LLM)</w:t>
+            </w:r>
+          </w:p>
+        </w:tc>
+        <w:tc>
+          <w:tcPr>
+            <w:tcW w:type="dxa" w:w="1234"/>
+            <w:shd w:val="clear" w:color="auto" w:fill="F2F6FC"/>
+          </w:tcPr>
+          <w:p>
+            <w:r/>
+            <w:r>
+              <w:rPr>
+                <w:sz w:val="18"/>
+              </w:rPr>
+              <w:t>81.1%</w:t>
+            </w:r>
+          </w:p>
+        </w:tc>
+        <w:tc>
+          <w:tcPr>
+            <w:tcW w:type="dxa" w:w="1234"/>
+            <w:shd w:val="clear" w:color="auto" w:fill="F2F6FC"/>
+          </w:tcPr>
+          <w:p>
+            <w:r/>
+            <w:r>
+              <w:rPr>
+                <w:sz w:val="18"/>
+              </w:rPr>
+              <w:t>58.3%</w:t>
+            </w:r>
+          </w:p>
+        </w:tc>
+        <w:tc>
+          <w:tcPr>
+            <w:tcW w:type="dxa" w:w="1234"/>
+            <w:shd w:val="clear" w:color="auto" w:fill="F2F6FC"/>
+          </w:tcPr>
+          <w:p>
+            <w:r/>
+            <w:r>
+              <w:rPr>
+                <w:sz w:val="18"/>
+              </w:rPr>
+              <w:t>0</w:t>
+            </w:r>
+          </w:p>
+        </w:tc>
+        <w:tc>
+          <w:tcPr>
+            <w:tcW w:type="dxa" w:w="1234"/>
+            <w:shd w:val="clear" w:color="auto" w:fill="F2F6FC"/>
+          </w:tcPr>
+          <w:p>
+            <w:r/>
+            <w:r>
+              <w:rPr>
+                <w:sz w:val="18"/>
+              </w:rPr>
+              <w:t>0</w:t>
+            </w:r>
+          </w:p>
+        </w:tc>
+        <w:tc>
+          <w:tcPr>
+            <w:tcW w:type="dxa" w:w="1234"/>
+            <w:shd w:val="clear" w:color="auto" w:fill="F2F6FC"/>
+          </w:tcPr>
+          <w:p>
+            <w:r/>
+            <w:r>
+              <w:rPr>
+                <w:sz w:val="18"/>
+              </w:rPr>
+              <w:t>-</w:t>
+            </w:r>
+          </w:p>
+        </w:tc>
+        <w:tc>
+          <w:tcPr>
+            <w:tcW w:type="dxa" w:w="1234"/>
+            <w:shd w:val="clear" w:color="auto" w:fill="F2F6FC"/>
+          </w:tcPr>
+          <w:p>
+            <w:r/>
+            <w:r>
+              <w:rPr>
+                <w:sz w:val="18"/>
+              </w:rPr>
+              <w:t>v9</w:t>
+            </w:r>
+          </w:p>
+        </w:tc>
+      </w:tr>
+      <w:tr>
+        <w:tc>
+          <w:tcPr>
+            <w:tcW w:type="dxa" w:w="1234"/>
+          </w:tcPr>
+          <w:p>
+            <w:r/>
+            <w:r>
+              <w:rPr>
+                <w:sz w:val="18"/>
+              </w:rPr>
+              <w:t>F1 organizer v3 + R6 (0 LLM)</w:t>
+            </w:r>
+          </w:p>
+        </w:tc>
+        <w:tc>
+          <w:tcPr>
+            <w:tcW w:type="dxa" w:w="1234"/>
+          </w:tcPr>
+          <w:p>
+            <w:r/>
+            <w:r>
+              <w:rPr>
+                <w:sz w:val="18"/>
+              </w:rPr>
+              <w:t>81.1%</w:t>
+            </w:r>
+          </w:p>
+        </w:tc>
+        <w:tc>
+          <w:tcPr>
+            <w:tcW w:type="dxa" w:w="1234"/>
+          </w:tcPr>
+          <w:p>
+            <w:r/>
+            <w:r>
+              <w:rPr>
+                <w:sz w:val="18"/>
+              </w:rPr>
+              <w:t>61.2%</w:t>
+            </w:r>
+          </w:p>
+        </w:tc>
+        <w:tc>
+          <w:tcPr>
+            <w:tcW w:type="dxa" w:w="1234"/>
+          </w:tcPr>
+          <w:p>
+            <w:r/>
+            <w:r>
+              <w:rPr>
+                <w:sz w:val="18"/>
+              </w:rPr>
+              <w:t>0</w:t>
+            </w:r>
+          </w:p>
+        </w:tc>
+        <w:tc>
+          <w:tcPr>
+            <w:tcW w:type="dxa" w:w="1234"/>
+          </w:tcPr>
+          <w:p>
+            <w:r/>
+            <w:r>
+              <w:rPr>
+                <w:sz w:val="18"/>
+              </w:rPr>
+              <w:t>0</w:t>
+            </w:r>
+          </w:p>
+        </w:tc>
+        <w:tc>
+          <w:tcPr>
+            <w:tcW w:type="dxa" w:w="1234"/>
+          </w:tcPr>
+          <w:p>
+            <w:r/>
+            <w:r>
+              <w:rPr>
+                <w:sz w:val="18"/>
+              </w:rPr>
+              <w:t>-</w:t>
+            </w:r>
+          </w:p>
+        </w:tc>
+        <w:tc>
+          <w:tcPr>
+            <w:tcW w:type="dxa" w:w="1234"/>
+          </w:tcPr>
+          <w:p>
+            <w:r/>
+            <w:r>
+              <w:rPr>
+                <w:sz w:val="18"/>
+              </w:rPr>
+              <w:t>v9</w:t>
+            </w:r>
+          </w:p>
+        </w:tc>
+      </w:tr>
+      <w:tr>
+        <w:tc>
+          <w:tcPr>
+            <w:tcW w:type="dxa" w:w="1234"/>
+            <w:shd w:val="clear" w:color="auto" w:fill="F2F6FC"/>
+          </w:tcPr>
+          <w:p>
+            <w:r/>
+            <w:r>
+              <w:rPr>
+                <w:sz w:val="18"/>
+              </w:rPr>
+              <w:t>REVIEW-001 needs_review field lemah (confidence berbasis pola)</w:t>
+            </w:r>
+          </w:p>
+        </w:tc>
+        <w:tc>
+          <w:tcPr>
+            <w:tcW w:type="dxa" w:w="1234"/>
+            <w:shd w:val="clear" w:color="auto" w:fill="F2F6FC"/>
+          </w:tcPr>
+          <w:p>
+            <w:r/>
+            <w:r>
+              <w:rPr>
+                <w:sz w:val="18"/>
+              </w:rPr>
+              <w:t>-</w:t>
+            </w:r>
+          </w:p>
+        </w:tc>
+        <w:tc>
+          <w:tcPr>
+            <w:tcW w:type="dxa" w:w="1234"/>
+            <w:shd w:val="clear" w:color="auto" w:fill="F2F6FC"/>
+          </w:tcPr>
+          <w:p>
+            <w:r/>
+            <w:r>
+              <w:rPr>
+                <w:sz w:val="18"/>
+              </w:rPr>
+              <w:t>-</w:t>
+            </w:r>
+          </w:p>
+        </w:tc>
+        <w:tc>
+          <w:tcPr>
+            <w:tcW w:type="dxa" w:w="1234"/>
+            <w:shd w:val="clear" w:color="auto" w:fill="F2F6FC"/>
+          </w:tcPr>
+          <w:p>
+            <w:r/>
+            <w:r>
+              <w:rPr>
+                <w:sz w:val="18"/>
+              </w:rPr>
+              <w:t>0</w:t>
+            </w:r>
+          </w:p>
+        </w:tc>
+        <w:tc>
+          <w:tcPr>
+            <w:tcW w:type="dxa" w:w="1234"/>
+            <w:shd w:val="clear" w:color="auto" w:fill="F2F6FC"/>
+          </w:tcPr>
+          <w:p>
+            <w:r/>
+            <w:r>
+              <w:rPr>
+                <w:sz w:val="18"/>
+              </w:rPr>
+              <w:t>0</w:t>
+            </w:r>
+          </w:p>
+        </w:tc>
+        <w:tc>
+          <w:tcPr>
+            <w:tcW w:type="dxa" w:w="1234"/>
+            <w:shd w:val="clear" w:color="auto" w:fill="F2F6FC"/>
+          </w:tcPr>
+          <w:p>
+            <w:r/>
+            <w:r>
+              <w:rPr>
+                <w:sz w:val="18"/>
+              </w:rPr>
+              <w:t>-</w:t>
+            </w:r>
+          </w:p>
+        </w:tc>
+        <w:tc>
+          <w:tcPr>
+            <w:tcW w:type="dxa" w:w="1234"/>
+            <w:shd w:val="clear" w:color="auto" w:fill="F2F6FC"/>
+          </w:tcPr>
+          <w:p>
+            <w:r/>
+            <w:r>
+              <w:rPr>
+                <w:sz w:val="18"/>
+              </w:rPr>
+              <w:t>v9</w:t>
+            </w:r>
+          </w:p>
+        </w:tc>
+      </w:tr>
+      <w:tr>
+        <w:tc>
+          <w:tcPr>
+            <w:tcW w:type="dxa" w:w="1234"/>
+          </w:tcPr>
+          <w:p>
+            <w:r/>
+            <w:r>
+              <w:rPr>
+                <w:sz w:val="18"/>
+              </w:rPr>
+              <w:t>STAT-001 validasi statistik 5-fold + bootstrap CI 1000×</w:t>
+            </w:r>
+          </w:p>
+        </w:tc>
+        <w:tc>
+          <w:tcPr>
+            <w:tcW w:type="dxa" w:w="1234"/>
+          </w:tcPr>
+          <w:p>
+            <w:r/>
+            <w:r>
+              <w:rPr>
+                <w:sz w:val="18"/>
+              </w:rPr>
+              <w:t>83.8%</w:t>
+            </w:r>
+          </w:p>
+        </w:tc>
+        <w:tc>
+          <w:tcPr>
+            <w:tcW w:type="dxa" w:w="1234"/>
+          </w:tcPr>
+          <w:p>
+            <w:r/>
+            <w:r>
+              <w:rPr>
+                <w:sz w:val="18"/>
+              </w:rPr>
+              <w:t>60.1%</w:t>
+            </w:r>
+          </w:p>
+        </w:tc>
+        <w:tc>
+          <w:tcPr>
+            <w:tcW w:type="dxa" w:w="1234"/>
+          </w:tcPr>
+          <w:p>
+            <w:r/>
+            <w:r>
+              <w:rPr>
+                <w:sz w:val="18"/>
+              </w:rPr>
+              <w:t>0</w:t>
+            </w:r>
+          </w:p>
+        </w:tc>
+        <w:tc>
+          <w:tcPr>
+            <w:tcW w:type="dxa" w:w="1234"/>
+          </w:tcPr>
+          <w:p>
+            <w:r/>
+            <w:r>
+              <w:rPr>
+                <w:sz w:val="18"/>
+              </w:rPr>
+              <w:t>29</w:t>
+            </w:r>
+          </w:p>
+        </w:tc>
+        <w:tc>
+          <w:tcPr>
+            <w:tcW w:type="dxa" w:w="1234"/>
+          </w:tcPr>
+          <w:p>
+            <w:r/>
+            <w:r>
+              <w:rPr>
+                <w:sz w:val="18"/>
+              </w:rPr>
+              <w:t>-</w:t>
+            </w:r>
+          </w:p>
+        </w:tc>
+        <w:tc>
+          <w:tcPr>
+            <w:tcW w:type="dxa" w:w="1234"/>
+          </w:tcPr>
+          <w:p>
+            <w:r/>
+            <w:r>
+              <w:rPr>
+                <w:sz w:val="18"/>
+              </w:rPr>
+              <w:t>v9</w:t>
+            </w:r>
+          </w:p>
+        </w:tc>
+      </w:tr>
+      <w:tr>
+        <w:tc>
+          <w:tcPr>
+            <w:tcW w:type="dxa" w:w="1234"/>
+            <w:shd w:val="clear" w:color="auto" w:fill="F2F6FC"/>
+          </w:tcPr>
+          <w:p>
+            <w:r/>
+            <w:r>
+              <w:rPr>
+                <w:sz w:val="18"/>
+              </w:rPr>
+              <w:t>KB-001 shadow replay key v1 (router→KB→LLM)</w:t>
+            </w:r>
+          </w:p>
+        </w:tc>
+        <w:tc>
+          <w:tcPr>
+            <w:tcW w:type="dxa" w:w="1234"/>
+            <w:shd w:val="clear" w:color="auto" w:fill="F2F6FC"/>
+          </w:tcPr>
+          <w:p>
+            <w:r/>
+            <w:r>
+              <w:rPr>
+                <w:sz w:val="18"/>
+              </w:rPr>
+              <w:t>84.4%</w:t>
+            </w:r>
+          </w:p>
+        </w:tc>
+        <w:tc>
+          <w:tcPr>
+            <w:tcW w:type="dxa" w:w="1234"/>
+            <w:shd w:val="clear" w:color="auto" w:fill="F2F6FC"/>
+          </w:tcPr>
+          <w:p>
+            <w:r/>
+            <w:r>
+              <w:rPr>
+                <w:sz w:val="18"/>
+              </w:rPr>
+              <w:t>-</w:t>
+            </w:r>
+          </w:p>
+        </w:tc>
+        <w:tc>
+          <w:tcPr>
+            <w:tcW w:type="dxa" w:w="1234"/>
+            <w:shd w:val="clear" w:color="auto" w:fill="F2F6FC"/>
+          </w:tcPr>
+          <w:p>
+            <w:r/>
+            <w:r>
+              <w:rPr>
+                <w:sz w:val="18"/>
+              </w:rPr>
+              <w:t>0</w:t>
+            </w:r>
+          </w:p>
+        </w:tc>
+        <w:tc>
+          <w:tcPr>
+            <w:tcW w:type="dxa" w:w="1234"/>
+            <w:shd w:val="clear" w:color="auto" w:fill="F2F6FC"/>
+          </w:tcPr>
+          <w:p>
+            <w:r/>
+            <w:r>
+              <w:rPr>
+                <w:sz w:val="18"/>
+              </w:rPr>
+              <w:t>29</w:t>
+            </w:r>
+          </w:p>
+        </w:tc>
+        <w:tc>
+          <w:tcPr>
+            <w:tcW w:type="dxa" w:w="1234"/>
+            <w:shd w:val="clear" w:color="auto" w:fill="F2F6FC"/>
+          </w:tcPr>
+          <w:p>
+            <w:r/>
+            <w:r>
+              <w:rPr>
+                <w:sz w:val="18"/>
+              </w:rPr>
+              <w:t>-</w:t>
+            </w:r>
+          </w:p>
+        </w:tc>
+        <w:tc>
+          <w:tcPr>
+            <w:tcW w:type="dxa" w:w="1234"/>
+            <w:shd w:val="clear" w:color="auto" w:fill="F2F6FC"/>
+          </w:tcPr>
+          <w:p>
+            <w:r/>
+            <w:r>
+              <w:rPr>
+                <w:sz w:val="18"/>
+              </w:rPr>
+              <w:t>v9</w:t>
+            </w:r>
+          </w:p>
+        </w:tc>
+      </w:tr>
+      <w:tr>
+        <w:tc>
+          <w:tcPr>
+            <w:tcW w:type="dxa" w:w="1234"/>
+          </w:tcPr>
+          <w:p>
+            <w:r/>
+            <w:r>
+              <w:rPr>
+                <w:sz w:val="18"/>
+              </w:rPr>
+              <w:t>KB-002 seeded persistent KB (smoke, ceiling, persistence, noise, fragmentasi)</w:t>
+            </w:r>
+          </w:p>
+        </w:tc>
+        <w:tc>
+          <w:tcPr>
+            <w:tcW w:type="dxa" w:w="1234"/>
+          </w:tcPr>
+          <w:p>
+            <w:r/>
+            <w:r>
+              <w:rPr>
+                <w:sz w:val="18"/>
+              </w:rPr>
+              <w:t>83.8%</w:t>
+            </w:r>
+          </w:p>
+        </w:tc>
+        <w:tc>
+          <w:tcPr>
+            <w:tcW w:type="dxa" w:w="1234"/>
+          </w:tcPr>
+          <w:p>
+            <w:r/>
+            <w:r>
+              <w:rPr>
+                <w:sz w:val="18"/>
+              </w:rPr>
+              <w:t>-</w:t>
+            </w:r>
+          </w:p>
+        </w:tc>
+        <w:tc>
+          <w:tcPr>
+            <w:tcW w:type="dxa" w:w="1234"/>
+          </w:tcPr>
+          <w:p>
+            <w:r/>
+            <w:r>
+              <w:rPr>
+                <w:sz w:val="18"/>
+              </w:rPr>
+              <w:t>0</w:t>
+            </w:r>
+          </w:p>
+        </w:tc>
+        <w:tc>
+          <w:tcPr>
+            <w:tcW w:type="dxa" w:w="1234"/>
+          </w:tcPr>
+          <w:p>
+            <w:r/>
+            <w:r>
+              <w:rPr>
+                <w:sz w:val="18"/>
+              </w:rPr>
+              <w:t>29</w:t>
+            </w:r>
+          </w:p>
+        </w:tc>
+        <w:tc>
+          <w:tcPr>
+            <w:tcW w:type="dxa" w:w="1234"/>
+          </w:tcPr>
+          <w:p>
+            <w:r/>
+            <w:r>
+              <w:rPr>
+                <w:sz w:val="18"/>
+              </w:rPr>
+              <w:t>-</w:t>
+            </w:r>
+          </w:p>
+        </w:tc>
+        <w:tc>
+          <w:tcPr>
+            <w:tcW w:type="dxa" w:w="1234"/>
+          </w:tcPr>
+          <w:p>
+            <w:r/>
+            <w:r>
+              <w:rPr>
+                <w:sz w:val="18"/>
+              </w:rPr>
+              <w:t>v9</w:t>
+            </w:r>
+          </w:p>
+        </w:tc>
+      </w:tr>
+      <w:tr>
+        <w:tc>
+          <w:tcPr>
+            <w:tcW w:type="dxa" w:w="1234"/>
+            <w:shd w:val="clear" w:color="auto" w:fill="F2F6FC"/>
+          </w:tcPr>
+          <w:p>
+            <w:r/>
+            <w:r>
+              <w:rPr>
+                <w:sz w:val="18"/>
+              </w:rPr>
+              <w:t>KB-003 normalisasi key v2 (plain/stem/alias/both)</w:t>
+            </w:r>
+          </w:p>
+        </w:tc>
+        <w:tc>
+          <w:tcPr>
+            <w:tcW w:type="dxa" w:w="1234"/>
+            <w:shd w:val="clear" w:color="auto" w:fill="F2F6FC"/>
+          </w:tcPr>
+          <w:p>
+            <w:r/>
+            <w:r>
+              <w:rPr>
+                <w:sz w:val="18"/>
+              </w:rPr>
+              <w:t>83.8%</w:t>
+            </w:r>
+          </w:p>
+        </w:tc>
+        <w:tc>
+          <w:tcPr>
+            <w:tcW w:type="dxa" w:w="1234"/>
+            <w:shd w:val="clear" w:color="auto" w:fill="F2F6FC"/>
+          </w:tcPr>
+          <w:p>
+            <w:r/>
+            <w:r>
+              <w:rPr>
+                <w:sz w:val="18"/>
+              </w:rPr>
+              <w:t>-</w:t>
+            </w:r>
+          </w:p>
+        </w:tc>
+        <w:tc>
+          <w:tcPr>
+            <w:tcW w:type="dxa" w:w="1234"/>
+            <w:shd w:val="clear" w:color="auto" w:fill="F2F6FC"/>
+          </w:tcPr>
+          <w:p>
+            <w:r/>
+            <w:r>
+              <w:rPr>
+                <w:sz w:val="18"/>
+              </w:rPr>
+              <w:t>0</w:t>
+            </w:r>
+          </w:p>
+        </w:tc>
+        <w:tc>
+          <w:tcPr>
+            <w:tcW w:type="dxa" w:w="1234"/>
+            <w:shd w:val="clear" w:color="auto" w:fill="F2F6FC"/>
+          </w:tcPr>
+          <w:p>
+            <w:r/>
+            <w:r>
+              <w:rPr>
+                <w:sz w:val="18"/>
+              </w:rPr>
+              <w:t>29</w:t>
+            </w:r>
+          </w:p>
+        </w:tc>
+        <w:tc>
+          <w:tcPr>
+            <w:tcW w:type="dxa" w:w="1234"/>
+            <w:shd w:val="clear" w:color="auto" w:fill="F2F6FC"/>
+          </w:tcPr>
+          <w:p>
+            <w:r/>
+            <w:r>
+              <w:rPr>
+                <w:sz w:val="18"/>
+              </w:rPr>
+              <w:t>-</w:t>
+            </w:r>
+          </w:p>
+        </w:tc>
+        <w:tc>
+          <w:tcPr>
+            <w:tcW w:type="dxa" w:w="1234"/>
+            <w:shd w:val="clear" w:color="auto" w:fill="F2F6FC"/>
+          </w:tcPr>
+          <w:p>
+            <w:r/>
+            <w:r>
+              <w:rPr>
+                <w:sz w:val="18"/>
+              </w:rPr>
+              <w:t>v9</w:t>
+            </w:r>
+          </w:p>
+        </w:tc>
+      </w:tr>
+      <w:tr>
+        <w:tc>
+          <w:tcPr>
+            <w:tcW w:type="dxa" w:w="1234"/>
+          </w:tcPr>
+          <w:p>
+            <w:r/>
+            <w:r>
+              <w:rPr>
+                <w:sz w:val="18"/>
+              </w:rPr>
+              <w:t>KB-004 alat audit korpus (tests/kb/audit.py)</w:t>
+            </w:r>
+          </w:p>
+        </w:tc>
+        <w:tc>
+          <w:tcPr>
+            <w:tcW w:type="dxa" w:w="1234"/>
+          </w:tcPr>
+          <w:p>
+            <w:r/>
+            <w:r>
+              <w:rPr>
+                <w:sz w:val="18"/>
+              </w:rPr>
+              <w:t>-</w:t>
+            </w:r>
+          </w:p>
+        </w:tc>
+        <w:tc>
+          <w:tcPr>
+            <w:tcW w:type="dxa" w:w="1234"/>
+          </w:tcPr>
+          <w:p>
+            <w:r/>
+            <w:r>
+              <w:rPr>
+                <w:sz w:val="18"/>
+              </w:rPr>
+              <w:t>-</w:t>
+            </w:r>
+          </w:p>
+        </w:tc>
+        <w:tc>
+          <w:tcPr>
+            <w:tcW w:type="dxa" w:w="1234"/>
+          </w:tcPr>
+          <w:p>
+            <w:r/>
+            <w:r>
+              <w:rPr>
+                <w:sz w:val="18"/>
+              </w:rPr>
+              <w:t>0</w:t>
+            </w:r>
+          </w:p>
+        </w:tc>
+        <w:tc>
+          <w:tcPr>
+            <w:tcW w:type="dxa" w:w="1234"/>
+          </w:tcPr>
+          <w:p>
+            <w:r/>
+            <w:r>
+              <w:rPr>
+                <w:sz w:val="18"/>
+              </w:rPr>
+              <w:t>0</w:t>
+            </w:r>
+          </w:p>
+        </w:tc>
+        <w:tc>
+          <w:tcPr>
+            <w:tcW w:type="dxa" w:w="1234"/>
+          </w:tcPr>
+          <w:p>
+            <w:r/>
+            <w:r>
+              <w:rPr>
+                <w:sz w:val="18"/>
+              </w:rPr>
+              <w:t>-</w:t>
+            </w:r>
+          </w:p>
+        </w:tc>
+        <w:tc>
+          <w:tcPr>
+            <w:tcW w:type="dxa" w:w="1234"/>
+          </w:tcPr>
+          <w:p>
+            <w:r/>
+            <w:r>
+              <w:rPr>
+                <w:sz w:val="18"/>
+              </w:rPr>
+              <w:t>v9</w:t>
+            </w:r>
+          </w:p>
+        </w:tc>
+      </w:tr>
+      <w:tr>
+        <w:tc>
+          <w:tcPr>
+            <w:tcW w:type="dxa" w:w="1234"/>
+            <w:shd w:val="clear" w:color="auto" w:fill="F2F6FC"/>
+          </w:tcPr>
+          <w:p>
+            <w:r/>
+            <w:r>
+              <w:rPr>
+                <w:sz w:val="18"/>
+              </w:rPr>
+              <w:t>KB-005 event_type=role terbaik (role/jenis/kelompok × 4 normalisasi)</w:t>
+            </w:r>
+          </w:p>
+        </w:tc>
+        <w:tc>
+          <w:tcPr>
+            <w:tcW w:type="dxa" w:w="1234"/>
+            <w:shd w:val="clear" w:color="auto" w:fill="F2F6FC"/>
+          </w:tcPr>
+          <w:p>
+            <w:r/>
+            <w:r>
+              <w:rPr>
+                <w:sz w:val="18"/>
+              </w:rPr>
+              <w:t>83.8%</w:t>
+            </w:r>
+          </w:p>
+        </w:tc>
+        <w:tc>
+          <w:tcPr>
+            <w:tcW w:type="dxa" w:w="1234"/>
+            <w:shd w:val="clear" w:color="auto" w:fill="F2F6FC"/>
+          </w:tcPr>
+          <w:p>
+            <w:r/>
+            <w:r>
+              <w:rPr>
+                <w:sz w:val="18"/>
+              </w:rPr>
+              <w:t>-</w:t>
+            </w:r>
+          </w:p>
+        </w:tc>
+        <w:tc>
+          <w:tcPr>
+            <w:tcW w:type="dxa" w:w="1234"/>
+            <w:shd w:val="clear" w:color="auto" w:fill="F2F6FC"/>
+          </w:tcPr>
+          <w:p>
+            <w:r/>
+            <w:r>
+              <w:rPr>
+                <w:sz w:val="18"/>
+              </w:rPr>
+              <w:t>0</w:t>
+            </w:r>
+          </w:p>
+        </w:tc>
+        <w:tc>
+          <w:tcPr>
+            <w:tcW w:type="dxa" w:w="1234"/>
+            <w:shd w:val="clear" w:color="auto" w:fill="F2F6FC"/>
+          </w:tcPr>
+          <w:p>
+            <w:r/>
+            <w:r>
+              <w:rPr>
+                <w:sz w:val="18"/>
+              </w:rPr>
+              <w:t>29</w:t>
+            </w:r>
+          </w:p>
+        </w:tc>
+        <w:tc>
+          <w:tcPr>
+            <w:tcW w:type="dxa" w:w="1234"/>
+            <w:shd w:val="clear" w:color="auto" w:fill="F2F6FC"/>
+          </w:tcPr>
+          <w:p>
+            <w:r/>
+            <w:r>
+              <w:rPr>
+                <w:sz w:val="18"/>
+              </w:rPr>
+              <w:t>-</w:t>
+            </w:r>
+          </w:p>
+        </w:tc>
+        <w:tc>
+          <w:tcPr>
+            <w:tcW w:type="dxa" w:w="1234"/>
+            <w:shd w:val="clear" w:color="auto" w:fill="F2F6FC"/>
+          </w:tcPr>
+          <w:p>
+            <w:r/>
+            <w:r>
+              <w:rPr>
+                <w:sz w:val="18"/>
+              </w:rPr>
+              <w:t>v9</w:t>
+            </w:r>
+          </w:p>
+        </w:tc>
+      </w:tr>
+      <w:tr>
+        <w:tc>
+          <w:tcPr>
+            <w:tcW w:type="dxa" w:w="1234"/>
+          </w:tcPr>
+          <w:p>
+            <w:r/>
+            <w:r>
+              <w:rPr>
+                <w:sz w:val="18"/>
+              </w:rPr>
+              <w:t>KB-006 alias mining data-driven (auto-alias = manual)</w:t>
+            </w:r>
+          </w:p>
+        </w:tc>
+        <w:tc>
+          <w:tcPr>
+            <w:tcW w:type="dxa" w:w="1234"/>
+          </w:tcPr>
+          <w:p>
+            <w:r/>
+            <w:r>
+              <w:rPr>
+                <w:sz w:val="18"/>
+              </w:rPr>
+              <w:t>83.8%</w:t>
+            </w:r>
+          </w:p>
+        </w:tc>
+        <w:tc>
+          <w:tcPr>
+            <w:tcW w:type="dxa" w:w="1234"/>
+          </w:tcPr>
+          <w:p>
+            <w:r/>
+            <w:r>
+              <w:rPr>
+                <w:sz w:val="18"/>
+              </w:rPr>
+              <w:t>-</w:t>
+            </w:r>
+          </w:p>
+        </w:tc>
+        <w:tc>
+          <w:tcPr>
+            <w:tcW w:type="dxa" w:w="1234"/>
+          </w:tcPr>
+          <w:p>
+            <w:r/>
+            <w:r>
+              <w:rPr>
+                <w:sz w:val="18"/>
+              </w:rPr>
+              <w:t>0</w:t>
+            </w:r>
+          </w:p>
+        </w:tc>
+        <w:tc>
+          <w:tcPr>
+            <w:tcW w:type="dxa" w:w="1234"/>
+          </w:tcPr>
+          <w:p>
+            <w:r/>
+            <w:r>
+              <w:rPr>
+                <w:sz w:val="18"/>
+              </w:rPr>
+              <w:t>29</w:t>
+            </w:r>
+          </w:p>
+        </w:tc>
+        <w:tc>
+          <w:tcPr>
+            <w:tcW w:type="dxa" w:w="1234"/>
+          </w:tcPr>
+          <w:p>
+            <w:r/>
+            <w:r>
+              <w:rPr>
+                <w:sz w:val="18"/>
+              </w:rPr>
+              <w:t>-</w:t>
+            </w:r>
+          </w:p>
+        </w:tc>
+        <w:tc>
+          <w:tcPr>
+            <w:tcW w:type="dxa" w:w="1234"/>
+          </w:tcPr>
+          <w:p>
+            <w:r/>
+            <w:r>
+              <w:rPr>
+                <w:sz w:val="18"/>
+              </w:rPr>
+              <w:t>v9</w:t>
+            </w:r>
+          </w:p>
+        </w:tc>
+      </w:tr>
+      <w:tr>
+        <w:tc>
+          <w:tcPr>
+            <w:tcW w:type="dxa" w:w="1234"/>
+            <w:shd w:val="clear" w:color="auto" w:fill="F2F6FC"/>
+          </w:tcPr>
+          <w:p>
+            <w:r/>
+            <w:r>
+              <w:rPr>
+                <w:sz w:val="18"/>
+              </w:rPr>
+              <w:t>OCR-007 LFM2.5-VL-3B probe (VLM OCR, GGUF Q4_0 + mmproj Q8_0, 10 scan)</w:t>
+            </w:r>
+          </w:p>
+        </w:tc>
+        <w:tc>
+          <w:tcPr>
+            <w:tcW w:type="dxa" w:w="1234"/>
+            <w:shd w:val="clear" w:color="auto" w:fill="F2F6FC"/>
+          </w:tcPr>
+          <w:p>
+            <w:r/>
+            <w:r>
+              <w:rPr>
+                <w:sz w:val="18"/>
+              </w:rPr>
+              <w:t>n/a</w:t>
+            </w:r>
+          </w:p>
+        </w:tc>
+        <w:tc>
+          <w:tcPr>
+            <w:tcW w:type="dxa" w:w="1234"/>
+            <w:shd w:val="clear" w:color="auto" w:fill="F2F6FC"/>
+          </w:tcPr>
+          <w:p>
+            <w:r/>
+            <w:r>
+              <w:rPr>
+                <w:sz w:val="18"/>
+              </w:rPr>
+              <w:t>44.4%</w:t>
+            </w:r>
+          </w:p>
+        </w:tc>
+        <w:tc>
+          <w:tcPr>
+            <w:tcW w:type="dxa" w:w="1234"/>
+            <w:shd w:val="clear" w:color="auto" w:fill="F2F6FC"/>
+          </w:tcPr>
+          <w:p>
+            <w:r/>
+            <w:r>
+              <w:rPr>
+                <w:sz w:val="18"/>
+              </w:rPr>
+              <w:t>0</w:t>
+            </w:r>
+          </w:p>
+        </w:tc>
+        <w:tc>
+          <w:tcPr>
+            <w:tcW w:type="dxa" w:w="1234"/>
+            <w:shd w:val="clear" w:color="auto" w:fill="F2F6FC"/>
+          </w:tcPr>
+          <w:p>
+            <w:r/>
+            <w:r>
+              <w:rPr>
+                <w:sz w:val="18"/>
+              </w:rPr>
+              <w:t>0</w:t>
+            </w:r>
+          </w:p>
+        </w:tc>
+        <w:tc>
+          <w:tcPr>
+            <w:tcW w:type="dxa" w:w="1234"/>
+            <w:shd w:val="clear" w:color="auto" w:fill="F2F6FC"/>
+          </w:tcPr>
+          <w:p>
+            <w:r/>
+            <w:r>
+              <w:rPr>
+                <w:sz w:val="18"/>
+              </w:rPr>
+              <w:t>-</w:t>
+            </w:r>
+          </w:p>
+        </w:tc>
+        <w:tc>
+          <w:tcPr>
+            <w:tcW w:type="dxa" w:w="1234"/>
+            <w:shd w:val="clear" w:color="auto" w:fill="F2F6FC"/>
+          </w:tcPr>
+          <w:p>
+            <w:r/>
+            <w:r>
+              <w:rPr>
+                <w:sz w:val="18"/>
+              </w:rPr>
+              <w:t>v9</w:t>
+            </w:r>
+          </w:p>
+        </w:tc>
+      </w:tr>
+      <w:tr>
+        <w:tc>
+          <w:tcPr>
+            <w:tcW w:type="dxa" w:w="1234"/>
+          </w:tcPr>
+          <w:p>
+            <w:r/>
+            <w:r>
+              <w:rPr>
+                <w:sz w:val="18"/>
+              </w:rPr>
+              <w:t>AKT-001 taksonomi nama_kegiatan (report-only, 6.8% exact)</w:t>
+            </w:r>
+          </w:p>
+        </w:tc>
+        <w:tc>
+          <w:tcPr>
+            <w:tcW w:type="dxa" w:w="1234"/>
+          </w:tcPr>
+          <w:p>
+            <w:r/>
+            <w:r>
+              <w:rPr>
+                <w:sz w:val="18"/>
+              </w:rPr>
+              <w:t>-</w:t>
+            </w:r>
+          </w:p>
+        </w:tc>
+        <w:tc>
+          <w:tcPr>
+            <w:tcW w:type="dxa" w:w="1234"/>
+          </w:tcPr>
+          <w:p>
+            <w:r/>
+            <w:r>
+              <w:rPr>
+                <w:sz w:val="18"/>
+              </w:rPr>
+              <w:t>-</w:t>
+            </w:r>
+          </w:p>
+        </w:tc>
+        <w:tc>
+          <w:tcPr>
+            <w:tcW w:type="dxa" w:w="1234"/>
+          </w:tcPr>
+          <w:p>
+            <w:r/>
+            <w:r>
+              <w:rPr>
+                <w:sz w:val="18"/>
+              </w:rPr>
+              <w:t>0</w:t>
+            </w:r>
+          </w:p>
+        </w:tc>
+        <w:tc>
+          <w:tcPr>
+            <w:tcW w:type="dxa" w:w="1234"/>
+          </w:tcPr>
+          <w:p>
+            <w:r/>
+            <w:r>
+              <w:rPr>
+                <w:sz w:val="18"/>
+              </w:rPr>
+              <w:t>0</w:t>
+            </w:r>
+          </w:p>
+        </w:tc>
+        <w:tc>
+          <w:tcPr>
+            <w:tcW w:type="dxa" w:w="1234"/>
+          </w:tcPr>
+          <w:p>
+            <w:r/>
+            <w:r>
+              <w:rPr>
+                <w:sz w:val="18"/>
+              </w:rPr>
+              <w:t>-</w:t>
+            </w:r>
+          </w:p>
+        </w:tc>
+        <w:tc>
+          <w:tcPr>
+            <w:tcW w:type="dxa" w:w="1234"/>
+          </w:tcPr>
+          <w:p>
+            <w:r/>
+            <w:r>
+              <w:rPr>
+                <w:sz w:val="18"/>
+              </w:rPr>
+              <w:t>v9</w:t>
+            </w:r>
+          </w:p>
+        </w:tc>
+      </w:tr>
+      <w:tr>
+        <w:tc>
+          <w:tcPr>
+            <w:tcW w:type="dxa" w:w="1234"/>
+            <w:shd w:val="clear" w:color="auto" w:fill="F2F6FC"/>
+          </w:tcPr>
+          <w:p>
+            <w:r/>
+            <w:r>
+              <w:rPr>
+                <w:sz w:val="18"/>
+              </w:rPr>
+              <w:t>AKT-002 deteksi nama_kegiatan v2 (0 LLM)</w:t>
+            </w:r>
+          </w:p>
+        </w:tc>
+        <w:tc>
+          <w:tcPr>
+            <w:tcW w:type="dxa" w:w="1234"/>
+            <w:shd w:val="clear" w:color="auto" w:fill="F2F6FC"/>
+          </w:tcPr>
+          <w:p>
+            <w:r/>
+            <w:r>
+              <w:rPr>
+                <w:sz w:val="18"/>
+              </w:rPr>
+              <w:t>81.1%</w:t>
+            </w:r>
+          </w:p>
+        </w:tc>
+        <w:tc>
+          <w:tcPr>
+            <w:tcW w:type="dxa" w:w="1234"/>
+            <w:shd w:val="clear" w:color="auto" w:fill="F2F6FC"/>
+          </w:tcPr>
+          <w:p>
+            <w:r/>
+            <w:r>
+              <w:rPr>
+                <w:sz w:val="18"/>
+              </w:rPr>
+              <w:t>68.8%</w:t>
+            </w:r>
+          </w:p>
+        </w:tc>
+        <w:tc>
+          <w:tcPr>
+            <w:tcW w:type="dxa" w:w="1234"/>
+            <w:shd w:val="clear" w:color="auto" w:fill="F2F6FC"/>
+          </w:tcPr>
+          <w:p>
+            <w:r/>
+            <w:r>
+              <w:rPr>
+                <w:sz w:val="18"/>
+              </w:rPr>
+              <w:t>0</w:t>
+            </w:r>
+          </w:p>
+        </w:tc>
+        <w:tc>
+          <w:tcPr>
+            <w:tcW w:type="dxa" w:w="1234"/>
+            <w:shd w:val="clear" w:color="auto" w:fill="F2F6FC"/>
+          </w:tcPr>
+          <w:p>
+            <w:r/>
+            <w:r>
+              <w:rPr>
+                <w:sz w:val="18"/>
+              </w:rPr>
+              <w:t>0</w:t>
+            </w:r>
+          </w:p>
+        </w:tc>
+        <w:tc>
+          <w:tcPr>
+            <w:tcW w:type="dxa" w:w="1234"/>
+            <w:shd w:val="clear" w:color="auto" w:fill="F2F6FC"/>
+          </w:tcPr>
+          <w:p>
+            <w:r/>
+            <w:r>
+              <w:rPr>
+                <w:sz w:val="18"/>
+              </w:rPr>
+              <w:t>-</w:t>
+            </w:r>
+          </w:p>
+        </w:tc>
+        <w:tc>
+          <w:tcPr>
+            <w:tcW w:type="dxa" w:w="1234"/>
+            <w:shd w:val="clear" w:color="auto" w:fill="F2F6FC"/>
+          </w:tcPr>
+          <w:p>
+            <w:r/>
+            <w:r>
+              <w:rPr>
+                <w:sz w:val="18"/>
+              </w:rPr>
+              <w:t>v9</w:t>
+            </w:r>
+          </w:p>
+        </w:tc>
+      </w:tr>
+      <w:tr>
+        <w:tc>
+          <w:tcPr>
+            <w:tcW w:type="dxa" w:w="1234"/>
+          </w:tcPr>
+          <w:p>
+            <w:r/>
+            <w:r>
+              <w:rPr>
+                <w:sz w:val="18"/>
+              </w:rPr>
+              <w:t>AKT-003 deteksi nama_kegiatan v3: Sebagai Peserta + atthe/inthe (0 LLM)</w:t>
+            </w:r>
+          </w:p>
+        </w:tc>
+        <w:tc>
+          <w:tcPr>
+            <w:tcW w:type="dxa" w:w="1234"/>
+          </w:tcPr>
+          <w:p>
+            <w:r/>
+            <w:r>
+              <w:rPr>
+                <w:sz w:val="18"/>
+              </w:rPr>
+              <w:t>81.1%</w:t>
+            </w:r>
+          </w:p>
+        </w:tc>
+        <w:tc>
+          <w:tcPr>
+            <w:tcW w:type="dxa" w:w="1234"/>
+          </w:tcPr>
+          <w:p>
+            <w:r/>
+            <w:r>
+              <w:rPr>
+                <w:sz w:val="18"/>
+              </w:rPr>
+              <w:t>71.6%</w:t>
+            </w:r>
+          </w:p>
+        </w:tc>
+        <w:tc>
+          <w:tcPr>
+            <w:tcW w:type="dxa" w:w="1234"/>
+          </w:tcPr>
+          <w:p>
+            <w:r/>
+            <w:r>
+              <w:rPr>
+                <w:sz w:val="18"/>
+              </w:rPr>
+              <w:t>0</w:t>
+            </w:r>
+          </w:p>
+        </w:tc>
+        <w:tc>
+          <w:tcPr>
+            <w:tcW w:type="dxa" w:w="1234"/>
+          </w:tcPr>
+          <w:p>
+            <w:r/>
+            <w:r>
+              <w:rPr>
+                <w:sz w:val="18"/>
+              </w:rPr>
+              <w:t>0</w:t>
+            </w:r>
+          </w:p>
+        </w:tc>
+        <w:tc>
+          <w:tcPr>
+            <w:tcW w:type="dxa" w:w="1234"/>
+          </w:tcPr>
+          <w:p>
+            <w:r/>
+            <w:r>
+              <w:rPr>
+                <w:sz w:val="18"/>
+              </w:rPr>
+              <w:t>-</w:t>
+            </w:r>
+          </w:p>
+        </w:tc>
+        <w:tc>
+          <w:tcPr>
+            <w:tcW w:type="dxa" w:w="1234"/>
+          </w:tcPr>
+          <w:p>
+            <w:r/>
+            <w:r>
+              <w:rPr>
+                <w:sz w:val="18"/>
+              </w:rPr>
+              <w:t>v9</w:t>
+            </w:r>
+          </w:p>
+        </w:tc>
+      </w:tr>
+      <w:tr>
+        <w:tc>
+          <w:tcPr>
+            <w:tcW w:type="dxa" w:w="1234"/>
+            <w:shd w:val="clear" w:color="auto" w:fill="F2F6FC"/>
+          </w:tcPr>
+          <w:p>
+            <w:r/>
+            <w:r>
+              <w:rPr>
+                <w:sz w:val="18"/>
+              </w:rPr>
+              <w:t>ORG-004 canonicalisasi format (0 LLM)</w:t>
+            </w:r>
+          </w:p>
+        </w:tc>
+        <w:tc>
+          <w:tcPr>
+            <w:tcW w:type="dxa" w:w="1234"/>
+            <w:shd w:val="clear" w:color="auto" w:fill="F2F6FC"/>
+          </w:tcPr>
+          <w:p>
+            <w:r/>
+            <w:r>
+              <w:rPr>
+                <w:sz w:val="18"/>
+              </w:rPr>
+              <w:t>81.1%</w:t>
+            </w:r>
+          </w:p>
+        </w:tc>
+        <w:tc>
+          <w:tcPr>
+            <w:tcW w:type="dxa" w:w="1234"/>
+            <w:shd w:val="clear" w:color="auto" w:fill="F2F6FC"/>
+          </w:tcPr>
+          <w:p>
+            <w:r/>
+            <w:r>
+              <w:rPr>
+                <w:sz w:val="18"/>
+              </w:rPr>
+              <w:t>63.5%</w:t>
+            </w:r>
+          </w:p>
+        </w:tc>
+        <w:tc>
+          <w:tcPr>
+            <w:tcW w:type="dxa" w:w="1234"/>
+            <w:shd w:val="clear" w:color="auto" w:fill="F2F6FC"/>
+          </w:tcPr>
+          <w:p>
+            <w:r/>
+            <w:r>
+              <w:rPr>
+                <w:sz w:val="18"/>
+              </w:rPr>
+              <w:t>0</w:t>
+            </w:r>
+          </w:p>
+        </w:tc>
+        <w:tc>
+          <w:tcPr>
+            <w:tcW w:type="dxa" w:w="1234"/>
+            <w:shd w:val="clear" w:color="auto" w:fill="F2F6FC"/>
+          </w:tcPr>
+          <w:p>
+            <w:r/>
+            <w:r>
+              <w:rPr>
+                <w:sz w:val="18"/>
+              </w:rPr>
+              <w:t>0</w:t>
+            </w:r>
+          </w:p>
+        </w:tc>
+        <w:tc>
+          <w:tcPr>
+            <w:tcW w:type="dxa" w:w="1234"/>
+            <w:shd w:val="clear" w:color="auto" w:fill="F2F6FC"/>
+          </w:tcPr>
+          <w:p>
+            <w:r/>
+            <w:r>
+              <w:rPr>
+                <w:sz w:val="18"/>
+              </w:rPr>
+              <w:t>-</w:t>
+            </w:r>
+          </w:p>
+        </w:tc>
+        <w:tc>
+          <w:tcPr>
+            <w:tcW w:type="dxa" w:w="1234"/>
+            <w:shd w:val="clear" w:color="auto" w:fill="F2F6FC"/>
+          </w:tcPr>
+          <w:p>
+            <w:r/>
+            <w:r>
+              <w:rPr>
+                <w:sz w:val="18"/>
+              </w:rPr>
+              <w:t>v9</w:t>
+            </w:r>
+          </w:p>
+        </w:tc>
+      </w:tr>
+      <w:tr>
+        <w:tc>
+          <w:tcPr>
+            <w:tcW w:type="dxa" w:w="1234"/>
+          </w:tcPr>
+          <w:p>
+            <w:r/>
+            <w:r>
+              <w:rPr>
+                <w:sz w:val="18"/>
+              </w:rPr>
+              <w:t>ORG-005 probe scoring extractor (sisa 12 kasus)</w:t>
+            </w:r>
+          </w:p>
+        </w:tc>
+        <w:tc>
+          <w:tcPr>
+            <w:tcW w:type="dxa" w:w="1234"/>
+          </w:tcPr>
+          <w:p>
+            <w:r/>
+            <w:r>
+              <w:rPr>
+                <w:sz w:val="18"/>
+              </w:rPr>
+              <w:t>-</w:t>
+            </w:r>
+          </w:p>
+        </w:tc>
+        <w:tc>
+          <w:tcPr>
+            <w:tcW w:type="dxa" w:w="1234"/>
+          </w:tcPr>
+          <w:p>
+            <w:r/>
+            <w:r>
+              <w:rPr>
+                <w:sz w:val="18"/>
+              </w:rPr>
+              <w:t>63.5%</w:t>
+            </w:r>
+          </w:p>
+        </w:tc>
+        <w:tc>
+          <w:tcPr>
+            <w:tcW w:type="dxa" w:w="1234"/>
+          </w:tcPr>
+          <w:p>
+            <w:r/>
+            <w:r>
+              <w:rPr>
+                <w:sz w:val="18"/>
+              </w:rPr>
+              <w:t>0</w:t>
+            </w:r>
+          </w:p>
+        </w:tc>
+        <w:tc>
+          <w:tcPr>
+            <w:tcW w:type="dxa" w:w="1234"/>
+          </w:tcPr>
+          <w:p>
+            <w:r/>
+            <w:r>
+              <w:rPr>
+                <w:sz w:val="18"/>
+              </w:rPr>
+              <w:t>0</w:t>
+            </w:r>
+          </w:p>
+        </w:tc>
+        <w:tc>
+          <w:tcPr>
+            <w:tcW w:type="dxa" w:w="1234"/>
+          </w:tcPr>
+          <w:p>
+            <w:r/>
+            <w:r>
+              <w:rPr>
+                <w:sz w:val="18"/>
+              </w:rPr>
+              <w:t>-</w:t>
+            </w:r>
+          </w:p>
+        </w:tc>
+        <w:tc>
+          <w:tcPr>
+            <w:tcW w:type="dxa" w:w="1234"/>
+          </w:tcPr>
+          <w:p>
+            <w:r/>
+            <w:r>
+              <w:rPr>
+                <w:sz w:val="18"/>
+              </w:rPr>
+              <w:t>v9</w:t>
+            </w:r>
+          </w:p>
+        </w:tc>
+      </w:tr>
+      <w:tr>
+        <w:tc>
+          <w:tcPr>
+            <w:tcW w:type="dxa" w:w="1234"/>
+            <w:shd w:val="clear" w:color="auto" w:fill="F2F6FC"/>
+          </w:tcPr>
+          <w:p>
+            <w:r/>
+            <w:r>
+              <w:rPr>
+                <w:sz w:val="18"/>
+              </w:rPr>
+              <w:t>PROD-002 port produksi organizer v3+R3+R6+format + nomor (flag-gated)</w:t>
+            </w:r>
+          </w:p>
+        </w:tc>
+        <w:tc>
+          <w:tcPr>
+            <w:tcW w:type="dxa" w:w="1234"/>
+            <w:shd w:val="clear" w:color="auto" w:fill="F2F6FC"/>
+          </w:tcPr>
+          <w:p>
+            <w:r/>
+            <w:r>
+              <w:rPr>
+                <w:sz w:val="18"/>
+              </w:rPr>
+              <w:t>81.1%</w:t>
+            </w:r>
+          </w:p>
+        </w:tc>
+        <w:tc>
+          <w:tcPr>
+            <w:tcW w:type="dxa" w:w="1234"/>
+            <w:shd w:val="clear" w:color="auto" w:fill="F2F6FC"/>
+          </w:tcPr>
+          <w:p>
+            <w:r/>
+            <w:r>
+              <w:rPr>
+                <w:sz w:val="18"/>
+              </w:rPr>
+              <w:t>63.0%</w:t>
+            </w:r>
+          </w:p>
+        </w:tc>
+        <w:tc>
+          <w:tcPr>
+            <w:tcW w:type="dxa" w:w="1234"/>
+            <w:shd w:val="clear" w:color="auto" w:fill="F2F6FC"/>
+          </w:tcPr>
+          <w:p>
+            <w:r/>
+            <w:r>
+              <w:rPr>
+                <w:sz w:val="18"/>
+              </w:rPr>
+              <w:t>0</w:t>
+            </w:r>
+          </w:p>
+        </w:tc>
+        <w:tc>
+          <w:tcPr>
+            <w:tcW w:type="dxa" w:w="1234"/>
+            <w:shd w:val="clear" w:color="auto" w:fill="F2F6FC"/>
+          </w:tcPr>
+          <w:p>
+            <w:r/>
+            <w:r>
+              <w:rPr>
+                <w:sz w:val="18"/>
+              </w:rPr>
+              <w:t>0</w:t>
+            </w:r>
+          </w:p>
+        </w:tc>
+        <w:tc>
+          <w:tcPr>
+            <w:tcW w:type="dxa" w:w="1234"/>
+            <w:shd w:val="clear" w:color="auto" w:fill="F2F6FC"/>
+          </w:tcPr>
+          <w:p>
+            <w:r/>
+            <w:r>
+              <w:rPr>
+                <w:sz w:val="18"/>
+              </w:rPr>
+              <w:t>-</w:t>
+            </w:r>
+          </w:p>
+        </w:tc>
+        <w:tc>
+          <w:tcPr>
+            <w:tcW w:type="dxa" w:w="1234"/>
+            <w:shd w:val="clear" w:color="auto" w:fill="F2F6FC"/>
+          </w:tcPr>
+          <w:p>
+            <w:r/>
+            <w:r>
+              <w:rPr>
+                <w:sz w:val="18"/>
+              </w:rPr>
+              <w:t>v9</w:t>
+            </w:r>
+          </w:p>
+        </w:tc>
+      </w:tr>
+      <w:tr>
+        <w:tc>
+          <w:tcPr>
+            <w:tcW w:type="dxa" w:w="1234"/>
+          </w:tcPr>
+          <w:p>
+            <w:r/>
+            <w:r>
+              <w:rPr>
+                <w:sz w:val="18"/>
+              </w:rPr>
+              <w:t>AKT-004 deteksi nama_kegiatan v4: Event/lomba/seminar on (0 LLM, gate scope-kecil)</w:t>
+            </w:r>
+          </w:p>
+        </w:tc>
+        <w:tc>
+          <w:tcPr>
+            <w:tcW w:type="dxa" w:w="1234"/>
+          </w:tcPr>
+          <w:p>
+            <w:r/>
+            <w:r>
+              <w:rPr>
+                <w:sz w:val="18"/>
+              </w:rPr>
+              <w:t>81.1%</w:t>
+            </w:r>
+          </w:p>
+        </w:tc>
+        <w:tc>
+          <w:tcPr>
+            <w:tcW w:type="dxa" w:w="1234"/>
+          </w:tcPr>
+          <w:p>
+            <w:r/>
+            <w:r>
+              <w:rPr>
+                <w:sz w:val="18"/>
+              </w:rPr>
+              <w:t>72.1%</w:t>
+            </w:r>
+          </w:p>
+        </w:tc>
+        <w:tc>
+          <w:tcPr>
+            <w:tcW w:type="dxa" w:w="1234"/>
+          </w:tcPr>
+          <w:p>
+            <w:r/>
+            <w:r>
+              <w:rPr>
+                <w:sz w:val="18"/>
+              </w:rPr>
+              <w:t>0</w:t>
+            </w:r>
+          </w:p>
+        </w:tc>
+        <w:tc>
+          <w:tcPr>
+            <w:tcW w:type="dxa" w:w="1234"/>
+          </w:tcPr>
+          <w:p>
+            <w:r/>
+            <w:r>
+              <w:rPr>
+                <w:sz w:val="18"/>
+              </w:rPr>
+              <w:t>0</w:t>
+            </w:r>
+          </w:p>
+        </w:tc>
+        <w:tc>
+          <w:tcPr>
+            <w:tcW w:type="dxa" w:w="1234"/>
+          </w:tcPr>
+          <w:p>
+            <w:r/>
+            <w:r>
+              <w:rPr>
+                <w:sz w:val="18"/>
+              </w:rPr>
+              <w:t>-</w:t>
+            </w:r>
+          </w:p>
+        </w:tc>
+        <w:tc>
+          <w:tcPr>
+            <w:tcW w:type="dxa" w:w="1234"/>
+          </w:tcPr>
+          <w:p>
+            <w:r/>
+            <w:r>
+              <w:rPr>
+                <w:sz w:val="18"/>
+              </w:rPr>
+              <w:t>v9</w:t>
+            </w:r>
+          </w:p>
+        </w:tc>
+      </w:tr>
+      <w:tr>
+        <w:tc>
+          <w:tcPr>
+            <w:tcW w:type="dxa" w:w="1234"/>
+            <w:shd w:val="clear" w:color="auto" w:fill="F2F6FC"/>
+          </w:tcPr>
+          <w:p>
+            <w:r/>
+            <w:r>
+              <w:rPr>
+                <w:sz w:val="18"/>
+              </w:rPr>
               <w:t>AKT-005 deteksi nama_kegiatan v5: grup D all-caps/spacing (0 LLM)</w:t>
             </w:r>
           </w:p>
@@ -5875,6 +7738,627 @@
                 <w:sz w:val="18"/>
               </w:rPr>
               <w:t>73.7%</w:t>
+            </w:r>
+          </w:p>
+        </w:tc>
+        <w:tc>
+          <w:tcPr>
+            <w:tcW w:type="dxa" w:w="1234"/>
+            <w:shd w:val="clear" w:color="auto" w:fill="F2F6FC"/>
+          </w:tcPr>
+          <w:p>
+            <w:r/>
+            <w:r>
+              <w:rPr>
+                <w:sz w:val="18"/>
+              </w:rPr>
+              <w:t>0</w:t>
+            </w:r>
+          </w:p>
+        </w:tc>
+        <w:tc>
+          <w:tcPr>
+            <w:tcW w:type="dxa" w:w="1234"/>
+            <w:shd w:val="clear" w:color="auto" w:fill="F2F6FC"/>
+          </w:tcPr>
+          <w:p>
+            <w:r/>
+            <w:r>
+              <w:rPr>
+                <w:sz w:val="18"/>
+              </w:rPr>
+              <w:t>0</w:t>
+            </w:r>
+          </w:p>
+        </w:tc>
+        <w:tc>
+          <w:tcPr>
+            <w:tcW w:type="dxa" w:w="1234"/>
+            <w:shd w:val="clear" w:color="auto" w:fill="F2F6FC"/>
+          </w:tcPr>
+          <w:p>
+            <w:r/>
+            <w:r>
+              <w:rPr>
+                <w:sz w:val="18"/>
+              </w:rPr>
+              <w:t>-</w:t>
+            </w:r>
+          </w:p>
+        </w:tc>
+        <w:tc>
+          <w:tcPr>
+            <w:tcW w:type="dxa" w:w="1234"/>
+            <w:shd w:val="clear" w:color="auto" w:fill="F2F6FC"/>
+          </w:tcPr>
+          <w:p>
+            <w:r/>
+            <w:r>
+              <w:rPr>
+                <w:sz w:val="18"/>
+              </w:rPr>
+              <w:t>v9</w:t>
+            </w:r>
+          </w:p>
+        </w:tc>
+      </w:tr>
+      <w:tr>
+        <w:tc>
+          <w:tcPr>
+            <w:tcW w:type="dxa" w:w="1234"/>
+          </w:tcPr>
+          <w:p>
+            <w:r/>
+            <w:r>
+              <w:rPr>
+                <w:sz w:val="18"/>
+              </w:rPr>
+              <w:t>KB-PROD-001 semantik produksi (servable/resolve/audit_due)</w:t>
+            </w:r>
+          </w:p>
+        </w:tc>
+        <w:tc>
+          <w:tcPr>
+            <w:tcW w:type="dxa" w:w="1234"/>
+          </w:tcPr>
+          <w:p>
+            <w:r/>
+            <w:r>
+              <w:rPr>
+                <w:sz w:val="18"/>
+              </w:rPr>
+              <w:t>-</w:t>
+            </w:r>
+          </w:p>
+        </w:tc>
+        <w:tc>
+          <w:tcPr>
+            <w:tcW w:type="dxa" w:w="1234"/>
+          </w:tcPr>
+          <w:p>
+            <w:r/>
+            <w:r>
+              <w:rPr>
+                <w:sz w:val="18"/>
+              </w:rPr>
+              <w:t>-</w:t>
+            </w:r>
+          </w:p>
+        </w:tc>
+        <w:tc>
+          <w:tcPr>
+            <w:tcW w:type="dxa" w:w="1234"/>
+          </w:tcPr>
+          <w:p>
+            <w:r/>
+            <w:r>
+              <w:rPr>
+                <w:sz w:val="18"/>
+              </w:rPr>
+              <w:t>0</w:t>
+            </w:r>
+          </w:p>
+        </w:tc>
+        <w:tc>
+          <w:tcPr>
+            <w:tcW w:type="dxa" w:w="1234"/>
+          </w:tcPr>
+          <w:p>
+            <w:r/>
+            <w:r>
+              <w:rPr>
+                <w:sz w:val="18"/>
+              </w:rPr>
+              <w:t>0</w:t>
+            </w:r>
+          </w:p>
+        </w:tc>
+        <w:tc>
+          <w:tcPr>
+            <w:tcW w:type="dxa" w:w="1234"/>
+          </w:tcPr>
+          <w:p>
+            <w:r/>
+            <w:r>
+              <w:rPr>
+                <w:sz w:val="18"/>
+              </w:rPr>
+              <w:t>-</w:t>
+            </w:r>
+          </w:p>
+        </w:tc>
+        <w:tc>
+          <w:tcPr>
+            <w:tcW w:type="dxa" w:w="1234"/>
+          </w:tcPr>
+          <w:p>
+            <w:r/>
+            <w:r>
+              <w:rPr>
+                <w:sz w:val="18"/>
+              </w:rPr>
+              <w:t>v9</w:t>
+            </w:r>
+          </w:p>
+        </w:tc>
+      </w:tr>
+      <w:tr>
+        <w:tc>
+          <w:tcPr>
+            <w:tcW w:type="dxa" w:w="1234"/>
+            <w:shd w:val="clear" w:color="auto" w:fill="F2F6FC"/>
+          </w:tcPr>
+          <w:p>
+            <w:r/>
+            <w:r>
+              <w:rPr>
+                <w:sz w:val="18"/>
+              </w:rPr>
+              <w:t>KB-SCALE-001 simulasi workload skewed (500-5000 req)</w:t>
+            </w:r>
+          </w:p>
+        </w:tc>
+        <w:tc>
+          <w:tcPr>
+            <w:tcW w:type="dxa" w:w="1234"/>
+            <w:shd w:val="clear" w:color="auto" w:fill="F2F6FC"/>
+          </w:tcPr>
+          <w:p>
+            <w:r/>
+            <w:r>
+              <w:rPr>
+                <w:sz w:val="18"/>
+              </w:rPr>
+              <w:t>-</w:t>
+            </w:r>
+          </w:p>
+        </w:tc>
+        <w:tc>
+          <w:tcPr>
+            <w:tcW w:type="dxa" w:w="1234"/>
+            <w:shd w:val="clear" w:color="auto" w:fill="F2F6FC"/>
+          </w:tcPr>
+          <w:p>
+            <w:r/>
+            <w:r>
+              <w:rPr>
+                <w:sz w:val="18"/>
+              </w:rPr>
+              <w:t>-</w:t>
+            </w:r>
+          </w:p>
+        </w:tc>
+        <w:tc>
+          <w:tcPr>
+            <w:tcW w:type="dxa" w:w="1234"/>
+            <w:shd w:val="clear" w:color="auto" w:fill="F2F6FC"/>
+          </w:tcPr>
+          <w:p>
+            <w:r/>
+            <w:r>
+              <w:rPr>
+                <w:sz w:val="18"/>
+              </w:rPr>
+              <w:t>0</w:t>
+            </w:r>
+          </w:p>
+        </w:tc>
+        <w:tc>
+          <w:tcPr>
+            <w:tcW w:type="dxa" w:w="1234"/>
+            <w:shd w:val="clear" w:color="auto" w:fill="F2F6FC"/>
+          </w:tcPr>
+          <w:p>
+            <w:r/>
+            <w:r>
+              <w:rPr>
+                <w:sz w:val="18"/>
+              </w:rPr>
+              <w:t>0</w:t>
+            </w:r>
+          </w:p>
+        </w:tc>
+        <w:tc>
+          <w:tcPr>
+            <w:tcW w:type="dxa" w:w="1234"/>
+            <w:shd w:val="clear" w:color="auto" w:fill="F2F6FC"/>
+          </w:tcPr>
+          <w:p>
+            <w:r/>
+            <w:r>
+              <w:rPr>
+                <w:sz w:val="18"/>
+              </w:rPr>
+              <w:t>-</w:t>
+            </w:r>
+          </w:p>
+        </w:tc>
+        <w:tc>
+          <w:tcPr>
+            <w:tcW w:type="dxa" w:w="1234"/>
+            <w:shd w:val="clear" w:color="auto" w:fill="F2F6FC"/>
+          </w:tcPr>
+          <w:p>
+            <w:r/>
+            <w:r>
+              <w:rPr>
+                <w:sz w:val="18"/>
+              </w:rPr>
+              <w:t>v9</w:t>
+            </w:r>
+          </w:p>
+        </w:tc>
+      </w:tr>
+      <w:tr>
+        <w:tc>
+          <w:tcPr>
+            <w:tcW w:type="dxa" w:w="1234"/>
+          </w:tcPr>
+          <w:p>
+            <w:r/>
+            <w:r>
+              <w:rPr>
+                <w:sz w:val="18"/>
+              </w:rPr>
+              <w:t>KB-SCALE-002 race tulis multi-worker (threading.Lock fix)</w:t>
+            </w:r>
+          </w:p>
+        </w:tc>
+        <w:tc>
+          <w:tcPr>
+            <w:tcW w:type="dxa" w:w="1234"/>
+          </w:tcPr>
+          <w:p>
+            <w:r/>
+            <w:r>
+              <w:rPr>
+                <w:sz w:val="18"/>
+              </w:rPr>
+              <w:t>-</w:t>
+            </w:r>
+          </w:p>
+        </w:tc>
+        <w:tc>
+          <w:tcPr>
+            <w:tcW w:type="dxa" w:w="1234"/>
+          </w:tcPr>
+          <w:p>
+            <w:r/>
+            <w:r>
+              <w:rPr>
+                <w:sz w:val="18"/>
+              </w:rPr>
+              <w:t>-</w:t>
+            </w:r>
+          </w:p>
+        </w:tc>
+        <w:tc>
+          <w:tcPr>
+            <w:tcW w:type="dxa" w:w="1234"/>
+          </w:tcPr>
+          <w:p>
+            <w:r/>
+            <w:r>
+              <w:rPr>
+                <w:sz w:val="18"/>
+              </w:rPr>
+              <w:t>0</w:t>
+            </w:r>
+          </w:p>
+        </w:tc>
+        <w:tc>
+          <w:tcPr>
+            <w:tcW w:type="dxa" w:w="1234"/>
+          </w:tcPr>
+          <w:p>
+            <w:r/>
+            <w:r>
+              <w:rPr>
+                <w:sz w:val="18"/>
+              </w:rPr>
+              <w:t>0</w:t>
+            </w:r>
+          </w:p>
+        </w:tc>
+        <w:tc>
+          <w:tcPr>
+            <w:tcW w:type="dxa" w:w="1234"/>
+          </w:tcPr>
+          <w:p>
+            <w:r/>
+            <w:r>
+              <w:rPr>
+                <w:sz w:val="18"/>
+              </w:rPr>
+              <w:t>-</w:t>
+            </w:r>
+          </w:p>
+        </w:tc>
+        <w:tc>
+          <w:tcPr>
+            <w:tcW w:type="dxa" w:w="1234"/>
+          </w:tcPr>
+          <w:p>
+            <w:r/>
+            <w:r>
+              <w:rPr>
+                <w:sz w:val="18"/>
+              </w:rPr>
+              <w:t>v9</w:t>
+            </w:r>
+          </w:p>
+        </w:tc>
+      </w:tr>
+      <w:tr>
+        <w:tc>
+          <w:tcPr>
+            <w:tcW w:type="dxa" w:w="1234"/>
+            <w:shd w:val="clear" w:color="auto" w:fill="F2F6FC"/>
+          </w:tcPr>
+          <w:p>
+            <w:r/>
+            <w:r>
+              <w:rPr>
+                <w:sz w:val="18"/>
+              </w:rPr>
+              <w:t>KB-SCALE-003 peta hemat (5 volume × 5 key space × 3 skew)</w:t>
+            </w:r>
+          </w:p>
+        </w:tc>
+        <w:tc>
+          <w:tcPr>
+            <w:tcW w:type="dxa" w:w="1234"/>
+            <w:shd w:val="clear" w:color="auto" w:fill="F2F6FC"/>
+          </w:tcPr>
+          <w:p>
+            <w:r/>
+            <w:r>
+              <w:rPr>
+                <w:sz w:val="18"/>
+              </w:rPr>
+              <w:t>-</w:t>
+            </w:r>
+          </w:p>
+        </w:tc>
+        <w:tc>
+          <w:tcPr>
+            <w:tcW w:type="dxa" w:w="1234"/>
+            <w:shd w:val="clear" w:color="auto" w:fill="F2F6FC"/>
+          </w:tcPr>
+          <w:p>
+            <w:r/>
+            <w:r>
+              <w:rPr>
+                <w:sz w:val="18"/>
+              </w:rPr>
+              <w:t>-</w:t>
+            </w:r>
+          </w:p>
+        </w:tc>
+        <w:tc>
+          <w:tcPr>
+            <w:tcW w:type="dxa" w:w="1234"/>
+            <w:shd w:val="clear" w:color="auto" w:fill="F2F6FC"/>
+          </w:tcPr>
+          <w:p>
+            <w:r/>
+            <w:r>
+              <w:rPr>
+                <w:sz w:val="18"/>
+              </w:rPr>
+              <w:t>0</w:t>
+            </w:r>
+          </w:p>
+        </w:tc>
+        <w:tc>
+          <w:tcPr>
+            <w:tcW w:type="dxa" w:w="1234"/>
+            <w:shd w:val="clear" w:color="auto" w:fill="F2F6FC"/>
+          </w:tcPr>
+          <w:p>
+            <w:r/>
+            <w:r>
+              <w:rPr>
+                <w:sz w:val="18"/>
+              </w:rPr>
+              <w:t>0</w:t>
+            </w:r>
+          </w:p>
+        </w:tc>
+        <w:tc>
+          <w:tcPr>
+            <w:tcW w:type="dxa" w:w="1234"/>
+            <w:shd w:val="clear" w:color="auto" w:fill="F2F6FC"/>
+          </w:tcPr>
+          <w:p>
+            <w:r/>
+            <w:r>
+              <w:rPr>
+                <w:sz w:val="18"/>
+              </w:rPr>
+              <w:t>-</w:t>
+            </w:r>
+          </w:p>
+        </w:tc>
+        <w:tc>
+          <w:tcPr>
+            <w:tcW w:type="dxa" w:w="1234"/>
+            <w:shd w:val="clear" w:color="auto" w:fill="F2F6FC"/>
+          </w:tcPr>
+          <w:p>
+            <w:r/>
+            <w:r>
+              <w:rPr>
+                <w:sz w:val="18"/>
+              </w:rPr>
+              <w:t>v9</w:t>
+            </w:r>
+          </w:p>
+        </w:tc>
+      </w:tr>
+      <w:tr>
+        <w:tc>
+          <w:tcPr>
+            <w:tcW w:type="dxa" w:w="1234"/>
+          </w:tcPr>
+          <w:p>
+            <w:r/>
+            <w:r>
+              <w:rPr>
+                <w:sz w:val="18"/>
+              </w:rPr>
+              <w:t>KB-SCALE-004 confirm 2x vs 3x (wrong +20 @2x)</w:t>
+            </w:r>
+          </w:p>
+        </w:tc>
+        <w:tc>
+          <w:tcPr>
+            <w:tcW w:type="dxa" w:w="1234"/>
+          </w:tcPr>
+          <w:p>
+            <w:r/>
+            <w:r>
+              <w:rPr>
+                <w:sz w:val="18"/>
+              </w:rPr>
+              <w:t>-</w:t>
+            </w:r>
+          </w:p>
+        </w:tc>
+        <w:tc>
+          <w:tcPr>
+            <w:tcW w:type="dxa" w:w="1234"/>
+          </w:tcPr>
+          <w:p>
+            <w:r/>
+            <w:r>
+              <w:rPr>
+                <w:sz w:val="18"/>
+              </w:rPr>
+              <w:t>-</w:t>
+            </w:r>
+          </w:p>
+        </w:tc>
+        <w:tc>
+          <w:tcPr>
+            <w:tcW w:type="dxa" w:w="1234"/>
+          </w:tcPr>
+          <w:p>
+            <w:r/>
+            <w:r>
+              <w:rPr>
+                <w:sz w:val="18"/>
+              </w:rPr>
+              <w:t>0</w:t>
+            </w:r>
+          </w:p>
+        </w:tc>
+        <w:tc>
+          <w:tcPr>
+            <w:tcW w:type="dxa" w:w="1234"/>
+          </w:tcPr>
+          <w:p>
+            <w:r/>
+            <w:r>
+              <w:rPr>
+                <w:sz w:val="18"/>
+              </w:rPr>
+              <w:t>0</w:t>
+            </w:r>
+          </w:p>
+        </w:tc>
+        <w:tc>
+          <w:tcPr>
+            <w:tcW w:type="dxa" w:w="1234"/>
+          </w:tcPr>
+          <w:p>
+            <w:r/>
+            <w:r>
+              <w:rPr>
+                <w:sz w:val="18"/>
+              </w:rPr>
+              <w:t>-</w:t>
+            </w:r>
+          </w:p>
+        </w:tc>
+        <w:tc>
+          <w:tcPr>
+            <w:tcW w:type="dxa" w:w="1234"/>
+          </w:tcPr>
+          <w:p>
+            <w:r/>
+            <w:r>
+              <w:rPr>
+                <w:sz w:val="18"/>
+              </w:rPr>
+              <w:t>v9</w:t>
+            </w:r>
+          </w:p>
+        </w:tc>
+      </w:tr>
+      <w:tr>
+        <w:tc>
+          <w:tcPr>
+            <w:tcW w:type="dxa" w:w="1234"/>
+            <w:shd w:val="clear" w:color="auto" w:fill="F2F6FC"/>
+          </w:tcPr>
+          <w:p>
+            <w:r/>
+            <w:r>
+              <w:rPr>
+                <w:sz w:val="18"/>
+              </w:rPr>
+              <w:t>KB-SCALE-005 akurasi+biaya e2e (hemat 87%, akurasi 99.3%)</w:t>
+            </w:r>
+          </w:p>
+        </w:tc>
+        <w:tc>
+          <w:tcPr>
+            <w:tcW w:type="dxa" w:w="1234"/>
+            <w:shd w:val="clear" w:color="auto" w:fill="F2F6FC"/>
+          </w:tcPr>
+          <w:p>
+            <w:r/>
+            <w:r>
+              <w:rPr>
+                <w:sz w:val="18"/>
+              </w:rPr>
+              <w:t>-</w:t>
+            </w:r>
+          </w:p>
+        </w:tc>
+        <w:tc>
+          <w:tcPr>
+            <w:tcW w:type="dxa" w:w="1234"/>
+            <w:shd w:val="clear" w:color="auto" w:fill="F2F6FC"/>
+          </w:tcPr>
+          <w:p>
+            <w:r/>
+            <w:r>
+              <w:rPr>
+                <w:sz w:val="18"/>
+              </w:rPr>
+              <w:t>99.3%</w:t>
             </w:r>
           </w:p>
         </w:tc>

</xml_diff>